<commit_message>
Update concise 6-slide PPT and 5-6 page Word documentation
</commit_message>
<xml_diff>
--- a/Lifedrop_Shivamogga_Project_Documentation.docx
+++ b/Lifedrop_Shivamogga_Project_Documentation.docx
@@ -4,124 +4,78 @@
   <w:body>
     <w:p>
       <w:pPr>
+        <w:spacing w:before="0" w:after="80"/>
         <w:jc w:val="center"/>
       </w:pPr>
       <w:r>
         <w:rPr>
+          <w:rFonts w:ascii="Arial" w:hAnsi="Arial"/>
           <w:b/>
           <w:color w:val="E11D48"/>
-          <w:sz w:val="22"/>
+          <w:sz w:val="44"/>
         </w:rPr>
-        <w:t>LIFEDROP SHIVAMOGGA EMERGENCY NETWORK</w:t>
+        <w:t>LIFEDROP SHIVAMOGGA</w:t>
         <w:br/>
       </w:r>
       <w:r>
         <w:rPr>
+          <w:rFonts w:ascii="Arial" w:hAnsi="Arial"/>
           <w:b/>
           <w:color w:val="0F172A"/>
-          <w:sz w:val="44"/>
+          <w:sz w:val="24"/>
         </w:rPr>
-        <w:t>Project Architecture &amp; Technical Specification Report</w:t>
+        <w:t>Rapid Emergency Blood Donor Network &amp; Triage Intelligence Platform</w:t>
+        <w:br/>
+      </w:r>
+      <w:r>
+        <w:rPr>
+          <w:rFonts w:ascii="Calibri" w:hAnsi="Calibri"/>
+          <w:i/>
+          <w:color w:val="64748B"/>
+          <w:sz w:val="19"/>
+        </w:rPr>
+        <w:t>Shivamogga District Emergency Healthcare &amp; Blood Donor Coordination System | Version 2.0</w:t>
       </w:r>
     </w:p>
     <w:p>
       <w:pPr>
-        <w:jc w:val="center"/>
+        <w:keepNext/>
+        <w:spacing w:before="280" w:after="80"/>
       </w:pPr>
       <w:r>
         <w:rPr>
-          <w:color w:val="64748B"/>
-          <w:sz w:val="19"/>
+          <w:rFonts w:ascii="Arial" w:hAnsi="Arial"/>
+          <w:b/>
+          <w:color w:val="E11D48"/>
+          <w:sz w:val="28"/>
         </w:rPr>
-        <w:t>Focus District: Shivamogga, Karnataka | Version: 2.4 | Status: Production Ready</w:t>
-        <w:br/>
-        <w:t>Generated: August 2026</w:t>
+        <w:t>1. Executive Summary &amp; Project Background</w:t>
       </w:r>
     </w:p>
     <w:p>
       <w:pPr>
-        <w:spacing w:after="240"/>
-      </w:pPr>
-    </w:p>
-    <w:p>
-      <w:pPr>
-        <w:pStyle w:val="Heading1"/>
+        <w:spacing w:after="80" w:line="276" w:lineRule="auto"/>
       </w:pPr>
       <w:r>
         <w:rPr>
-          <w:color w:val="E11D48"/>
+          <w:rFonts w:ascii="Calibri" w:hAnsi="Calibri"/>
+          <w:color w:val="334155"/>
+          <w:sz w:val="20"/>
         </w:rPr>
-        <w:t>1. Executive Summary</w:t>
-      </w:r>
-    </w:p>
-    <w:p>
-      <w:r>
-        <w:t>Lifedrop is a full-stack, real-time emergency blood donor mobilization and GIS dispatch platform built exclusively for Shivamogga District, Karnataka. The platform bridges the life-critical gap between patients experiencing acute trauma, scheduled surgeries, or maternal complications at major medical centers (such as McGann Teaching Hospital &amp; SIMS, Sahyadri Narayana Multispeciality Hospital, Nanjappa Hospital, and District Government Hospital) and verified volunteer blood donors living across Shivamogga city and surrounding taluks (Sagara, Bhadravathi, Thirthahalli, Shikaripura).</w:t>
-      </w:r>
-    </w:p>
-    <w:p>
-      <w:r>
-        <w:t>By integrating an interactive OpenStreetMap/Leaflet dispatch engine, an anti-hallucination conversational AI triage assistant, real-time regional blood bank inventory telemetry, and a digital volunteer Hero Pass registry, Lifedrop compresses the blood requisition lifecycle from hours to under 15 minutes.</w:t>
+        <w:t>Lifedrop is an emergency medical response platform designed to eliminate fatal delays in blood procurement across Shivamogga and the wider Malnad region. In critical emergency situations—such as severe road traffic accidents, acute postpartum haemorrhage, oncological surgeries, and dengue-induced severe thrombocytopenia—access to compatible blood within the 'Golden Hour' is the primary determinant of patient survival.</w:t>
       </w:r>
     </w:p>
     <w:p>
       <w:pPr>
-        <w:pStyle w:val="Heading1"/>
+        <w:spacing w:after="80" w:line="276" w:lineRule="auto"/>
       </w:pPr>
       <w:r>
         <w:rPr>
-          <w:color w:val="E11D48"/>
+          <w:rFonts w:ascii="Calibri" w:hAnsi="Calibri"/>
+          <w:color w:val="334155"/>
+          <w:sz w:val="20"/>
         </w:rPr>
-        <w:t>2. Problem Statement &amp; Regional Healthcare Need in Shivamogga</w:t>
-      </w:r>
-    </w:p>
-    <w:p>
-      <w:r>
-        <w:rPr>
-          <w:b/>
-        </w:rPr>
-        <w:t xml:space="preserve">1. Severe Time Lag in Trauma Cases: </w:t>
-      </w:r>
-      <w:r>
-        <w:t>Emergency transfusions require swift blood cross-matching. Traditional word-of-mouth and social media appeals frequently take 2 to 6 hours.</w:t>
-      </w:r>
-    </w:p>
-    <w:p>
-      <w:r>
-        <w:rPr>
-          <w:b/>
-        </w:rPr>
-        <w:t xml:space="preserve">2. Rare Blood Group Shortages: </w:t>
-      </w:r>
-      <w:r>
-        <w:t>Blood types such as O- (Universal Donor) and B- experience recurrent shortages across Shivamogga blood centers, leading to high-risk surgery postponements.</w:t>
-      </w:r>
-    </w:p>
-    <w:p>
-      <w:r>
-        <w:rPr>
-          <w:b/>
-        </w:rPr>
-        <w:t xml:space="preserve">3. Geographic Distance Across Taluks: </w:t>
-      </w:r>
-      <w:r>
-        <w:t>Patients traveling to McGann Hospital from rural taluks often lack localized donor networks. Lifedrop coordinates donors across Sagara, Bhadravathi, and Thirthahalli.</w:t>
-      </w:r>
-    </w:p>
-    <w:p>
-      <w:pPr>
-        <w:pStyle w:val="Heading1"/>
-      </w:pPr>
-      <w:r>
-        <w:rPr>
-          <w:color w:val="E11D48"/>
-        </w:rPr>
-        <w:t>3. Core System Architecture</w:t>
-      </w:r>
-    </w:p>
-    <w:p>
-      <w:r>
-        <w:t>Lifedrop follows a decoupled, resilient architecture designed for zero downtime during network degradations:</w:t>
+        <w:t>Traditional blood search methods rely on fragmented social media broadcasts, manual phone calls to acquaintances, and physical visits to multiple hospital blood banks. This manual workflow frequently causes delays of 2 to 6 hours. Lifedrop re-engineers this pipeline into an automated, real-time matching system that dispatches alerts to verified, compatible donors within minutes.</w:t>
       </w:r>
     </w:p>
     <w:tbl>
@@ -131,217 +85,41 @@
         <w:tblLook w:firstColumn="1" w:firstRow="1" w:lastColumn="0" w:lastRow="0" w:noHBand="0" w:noVBand="1" w:val="04A0"/>
       </w:tblPr>
       <w:tblGrid>
-        <w:gridCol w:w="3120"/>
-        <w:gridCol w:w="3120"/>
-        <w:gridCol w:w="3120"/>
+        <w:gridCol w:w="9936"/>
       </w:tblGrid>
       <w:tr>
         <w:tc>
           <w:tcPr>
-            <w:tcW w:type="dxa" w:w="3120"/>
-            <w:shd w:val="clear" w:color="auto" w:fill="0F172A"/>
+            <w:tcW w:type="dxa" w:w="9792"/>
+            <w:shd w:fill="FFF1F2"/>
+            <w:tcMar>
+              <w:top w:w="120" w:type="dxa"/>
+              <w:bottom w:w="120" w:type="dxa"/>
+              <w:left w:w="180" w:type="dxa"/>
+              <w:right w:w="180" w:type="dxa"/>
+            </w:tcMar>
           </w:tcPr>
           <w:p>
+            <w:pPr>
+              <w:spacing w:after="40"/>
+            </w:pPr>
             <w:r>
               <w:rPr>
+                <w:rFonts w:ascii="Arial" w:hAnsi="Arial"/>
                 <w:b/>
-                <w:color w:val="FFFFFF"/>
+                <w:color w:val="E11D48"/>
+                <w:sz w:val="21"/>
               </w:rPr>
-              <w:t>Tier / Component</w:t>
+              <w:t>📌 Mission Statement</w:t>
+              <w:br/>
             </w:r>
-          </w:p>
-        </w:tc>
-        <w:tc>
-          <w:tcPr>
-            <w:tcW w:type="dxa" w:w="3120"/>
-            <w:shd w:val="clear" w:color="auto" w:fill="0F172A"/>
-          </w:tcPr>
-          <w:p>
             <w:r>
               <w:rPr>
-                <w:b/>
-                <w:color w:val="FFFFFF"/>
-              </w:rPr>
-              <w:t>Technology Stack</w:t>
-            </w:r>
-          </w:p>
-        </w:tc>
-        <w:tc>
-          <w:tcPr>
-            <w:tcW w:type="dxa" w:w="3120"/>
-            <w:shd w:val="clear" w:color="auto" w:fill="0F172A"/>
-          </w:tcPr>
-          <w:p>
-            <w:r>
-              <w:rPr>
-                <w:b/>
-                <w:color w:val="FFFFFF"/>
-              </w:rPr>
-              <w:t>Key Responsibilities</w:t>
-            </w:r>
-          </w:p>
-        </w:tc>
-      </w:tr>
-      <w:tr>
-        <w:tc>
-          <w:tcPr>
-            <w:tcW w:type="dxa" w:w="3120"/>
-          </w:tcPr>
-          <w:p>
-            <w:r>
-              <w:rPr>
+                <w:rFonts w:ascii="Calibri" w:hAnsi="Calibri"/>
+                <w:color w:val="1E293B"/>
                 <w:sz w:val="19"/>
               </w:rPr>
-              <w:t>Frontend Presentation</w:t>
-            </w:r>
-          </w:p>
-        </w:tc>
-        <w:tc>
-          <w:tcPr>
-            <w:tcW w:type="dxa" w:w="3120"/>
-          </w:tcPr>
-          <w:p>
-            <w:r>
-              <w:rPr>
-                <w:sz w:val="19"/>
-              </w:rPr>
-              <w:t>Vanilla HTML5, CSS3, ES6+ JavaScript, Leaflet GIS</w:t>
-            </w:r>
-          </w:p>
-        </w:tc>
-        <w:tc>
-          <w:tcPr>
-            <w:tcW w:type="dxa" w:w="3120"/>
-          </w:tcPr>
-          <w:p>
-            <w:r>
-              <w:rPr>
-                <w:sz w:val="19"/>
-              </w:rPr>
-              <w:t>Responsive client portal, live donor map with turn-by-turn guidance, hero pass rendering, multi-theme selector.</w:t>
-            </w:r>
-          </w:p>
-        </w:tc>
-      </w:tr>
-      <w:tr>
-        <w:tc>
-          <w:tcPr>
-            <w:tcW w:type="dxa" w:w="3120"/>
-          </w:tcPr>
-          <w:p>
-            <w:r>
-              <w:rPr>
-                <w:sz w:val="19"/>
-              </w:rPr>
-              <w:t>Backend Services</w:t>
-            </w:r>
-          </w:p>
-        </w:tc>
-        <w:tc>
-          <w:tcPr>
-            <w:tcW w:type="dxa" w:w="3120"/>
-          </w:tcPr>
-          <w:p>
-            <w:r>
-              <w:rPr>
-                <w:sz w:val="19"/>
-              </w:rPr>
-              <w:t>Python 3.12, Flask, RESTful API endpoints</w:t>
-            </w:r>
-          </w:p>
-        </w:tc>
-        <w:tc>
-          <w:tcPr>
-            <w:tcW w:type="dxa" w:w="3120"/>
-          </w:tcPr>
-          <w:p>
-            <w:r>
-              <w:rPr>
-                <w:sz w:val="19"/>
-              </w:rPr>
-              <w:t>Stateful AI chat intent routing, request dispatch orchestration, donor matching algorithms, inventory telemetry.</w:t>
-            </w:r>
-          </w:p>
-        </w:tc>
-      </w:tr>
-      <w:tr>
-        <w:tc>
-          <w:tcPr>
-            <w:tcW w:type="dxa" w:w="3120"/>
-          </w:tcPr>
-          <w:p>
-            <w:r>
-              <w:rPr>
-                <w:sz w:val="19"/>
-              </w:rPr>
-              <w:t>Data Persistence</w:t>
-            </w:r>
-          </w:p>
-        </w:tc>
-        <w:tc>
-          <w:tcPr>
-            <w:tcW w:type="dxa" w:w="3120"/>
-          </w:tcPr>
-          <w:p>
-            <w:r>
-              <w:rPr>
-                <w:sz w:val="19"/>
-              </w:rPr>
-              <w:t>SQLite (`lifedrop.db`), Client LocalStorage Cache</w:t>
-            </w:r>
-          </w:p>
-        </w:tc>
-        <w:tc>
-          <w:tcPr>
-            <w:tcW w:type="dxa" w:w="3120"/>
-          </w:tcPr>
-          <w:p>
-            <w:r>
-              <w:rPr>
-                <w:sz w:val="19"/>
-              </w:rPr>
-              <w:t>Relational persistence with foreign keys and WAL mode; synchronized client-side offline store.</w:t>
-            </w:r>
-          </w:p>
-        </w:tc>
-      </w:tr>
-      <w:tr>
-        <w:tc>
-          <w:tcPr>
-            <w:tcW w:type="dxa" w:w="3120"/>
-          </w:tcPr>
-          <w:p>
-            <w:r>
-              <w:rPr>
-                <w:sz w:val="19"/>
-              </w:rPr>
-              <w:t>GIS &amp; Geocoding</w:t>
-            </w:r>
-          </w:p>
-        </w:tc>
-        <w:tc>
-          <w:tcPr>
-            <w:tcW w:type="dxa" w:w="3120"/>
-          </w:tcPr>
-          <w:p>
-            <w:r>
-              <w:rPr>
-                <w:sz w:val="19"/>
-              </w:rPr>
-              <w:t>OpenStreetMap, Leaflet Engine, Google Maps API</w:t>
-            </w:r>
-          </w:p>
-        </w:tc>
-        <w:tc>
-          <w:tcPr>
-            <w:tcW w:type="dxa" w:w="3120"/>
-          </w:tcPr>
-          <w:p>
-            <w:r>
-              <w:rPr>
-                <w:sz w:val="19"/>
-              </w:rPr>
-              <w:t>Accurate hospital GPS coordinates, glowing route polyline calculation, real-time travel time &amp; distance telemetry.</w:t>
+              <w:t>To build a resilient, zero-lag volunteer blood donation infrastructure in Shivamogga that guarantees no patient loses their life due to the unavailability of compatible blood or lack of donor connectivity.</w:t>
             </w:r>
           </w:p>
         </w:tc>
@@ -349,98 +127,238 @@
     </w:tbl>
     <w:p>
       <w:pPr>
-        <w:spacing w:after="200"/>
+        <w:spacing w:after="80"/>
       </w:pPr>
     </w:p>
     <w:p>
       <w:pPr>
-        <w:pStyle w:val="Heading1"/>
+        <w:keepNext/>
+        <w:spacing w:before="200" w:after="40"/>
       </w:pPr>
       <w:r>
         <w:rPr>
-          <w:color w:val="E11D48"/>
+          <w:rFonts w:ascii="Arial" w:hAnsi="Arial"/>
+          <w:b/>
+          <w:color w:val="1E293B"/>
+          <w:sz w:val="23"/>
         </w:rPr>
-        <w:t>4. Key Feature Implementations</w:t>
+        <w:t>1.1 Core Problem Statement &amp; Regional Healthcare Challenges</w:t>
       </w:r>
     </w:p>
     <w:p>
       <w:pPr>
-        <w:pStyle w:val="Heading2"/>
+        <w:spacing w:after="80" w:line="276" w:lineRule="auto"/>
       </w:pPr>
       <w:r>
         <w:rPr>
+          <w:rFonts w:ascii="Calibri" w:hAnsi="Calibri"/>
+          <w:color w:val="334155"/>
+          <w:sz w:val="20"/>
+        </w:rPr>
+        <w:t>The healthcare ecosystem in Shivamogga faces four primary blood availability bottlenecks:</w:t>
+      </w:r>
+    </w:p>
+    <w:p>
+      <w:pPr>
+        <w:spacing w:after="80" w:line="276" w:lineRule="auto"/>
+      </w:pPr>
+      <w:r>
+        <w:rPr>
+          <w:rFonts w:ascii="Calibri" w:hAnsi="Calibri"/>
+          <w:b/>
+          <w:color w:val="0F172A"/>
+          <w:sz w:val="20"/>
+        </w:rPr>
+        <w:t xml:space="preserve">1. Fragmented Inventory: </w:t>
+      </w:r>
+      <w:r>
+        <w:rPr>
+          <w:rFonts w:ascii="Calibri" w:hAnsi="Calibri"/>
+          <w:color w:val="334155"/>
+          <w:sz w:val="20"/>
+        </w:rPr>
+        <w:t>Lack of a unified digital registry makes it difficult to ascertain which hospital (McGann, Sahyadri, Nanjappa, or Rotary) has specific units.</w:t>
+      </w:r>
+    </w:p>
+    <w:p>
+      <w:pPr>
+        <w:spacing w:after="80" w:line="276" w:lineRule="auto"/>
+      </w:pPr>
+      <w:r>
+        <w:rPr>
+          <w:rFonts w:ascii="Calibri" w:hAnsi="Calibri"/>
+          <w:b/>
+          <w:color w:val="0F172A"/>
+          <w:sz w:val="20"/>
+        </w:rPr>
+        <w:t xml:space="preserve">2. Rare Blood Accessibility: </w:t>
+      </w:r>
+      <w:r>
+        <w:rPr>
+          <w:rFonts w:ascii="Calibri" w:hAnsi="Calibri"/>
+          <w:color w:val="334155"/>
+          <w:sz w:val="20"/>
+        </w:rPr>
+        <w:t>Patients with rare blood groups (such as O-negative, AB-negative, or Bombay phenotype) face high mortality risks due to lack of an on-demand donor registry.</w:t>
+      </w:r>
+    </w:p>
+    <w:p>
+      <w:pPr>
+        <w:spacing w:after="80" w:line="276" w:lineRule="auto"/>
+      </w:pPr>
+      <w:r>
+        <w:rPr>
+          <w:rFonts w:ascii="Calibri" w:hAnsi="Calibri"/>
+          <w:b/>
+          <w:color w:val="0F172A"/>
+          <w:sz w:val="20"/>
+        </w:rPr>
+        <w:t xml:space="preserve">3. Unverified Emergency Broadcasts: </w:t>
+      </w:r>
+      <w:r>
+        <w:rPr>
+          <w:rFonts w:ascii="Calibri" w:hAnsi="Calibri"/>
+          <w:color w:val="334155"/>
+          <w:sz w:val="20"/>
+        </w:rPr>
+        <w:t>Social media appeals lack clinical verification, leading to spam calls, expired requests, and delayed actual donor responses.</w:t>
+      </w:r>
+    </w:p>
+    <w:p>
+      <w:pPr>
+        <w:spacing w:after="80" w:line="276" w:lineRule="auto"/>
+      </w:pPr>
+      <w:r>
+        <w:rPr>
+          <w:rFonts w:ascii="Calibri" w:hAnsi="Calibri"/>
+          <w:b/>
+          <w:color w:val="0F172A"/>
+          <w:sz w:val="20"/>
+        </w:rPr>
+        <w:t xml:space="preserve">4. Geographic &amp; Transport Latency: </w:t>
+      </w:r>
+      <w:r>
+        <w:rPr>
+          <w:rFonts w:ascii="Calibri" w:hAnsi="Calibri"/>
+          <w:color w:val="334155"/>
+          <w:sz w:val="20"/>
+        </w:rPr>
+        <w:t>Surrounding rural taluks (Thirthahalli, Sagara, Sorab, Hosanagara) must transfer patients to district headquarters without confirmed blood availability.</w:t>
+      </w:r>
+    </w:p>
+    <w:p>
+      <w:pPr>
+        <w:keepNext/>
+        <w:spacing w:before="200" w:after="40"/>
+      </w:pPr>
+      <w:r>
+        <w:rPr>
+          <w:rFonts w:ascii="Arial" w:hAnsi="Arial"/>
+          <w:b/>
           <w:color w:val="1E293B"/>
+          <w:sz w:val="23"/>
         </w:rPr>
-        <w:t>4.1 Live Donor Emergency Route &amp; Navigation Map</w:t>
+        <w:t>1.2 Strategic Objectives</w:t>
+      </w:r>
+    </w:p>
+    <w:p>
+      <w:pPr>
+        <w:spacing w:after="80" w:line="276" w:lineRule="auto"/>
+      </w:pPr>
+      <w:r>
+        <w:rPr>
+          <w:rFonts w:ascii="Calibri" w:hAnsi="Calibri"/>
+          <w:color w:val="334155"/>
+          <w:sz w:val="20"/>
+        </w:rPr>
+        <w:t>• Reduce the average emergency donor matching and confirmation time to under 15 minutes.</w:t>
+      </w:r>
+    </w:p>
+    <w:p>
+      <w:pPr>
+        <w:spacing w:after="80" w:line="276" w:lineRule="auto"/>
+      </w:pPr>
+      <w:r>
+        <w:rPr>
+          <w:rFonts w:ascii="Calibri" w:hAnsi="Calibri"/>
+          <w:color w:val="334155"/>
+          <w:sz w:val="20"/>
+        </w:rPr>
+        <w:t>• Provide a transparent, interactive ABO/Rh compatibility engine for clinical accuracy.</w:t>
+      </w:r>
+    </w:p>
+    <w:p>
+      <w:pPr>
+        <w:spacing w:after="80" w:line="276" w:lineRule="auto"/>
+      </w:pPr>
+      <w:r>
+        <w:rPr>
+          <w:rFonts w:ascii="Calibri" w:hAnsi="Calibri"/>
+          <w:color w:val="334155"/>
+          <w:sz w:val="20"/>
+        </w:rPr>
+        <w:t>• Implement live GPS-enabled tracking for emergency blood dispatches to keep attendants informed.</w:t>
+      </w:r>
+    </w:p>
+    <w:p>
+      <w:pPr>
+        <w:spacing w:after="80" w:line="276" w:lineRule="auto"/>
+      </w:pPr>
+      <w:r>
+        <w:rPr>
+          <w:rFonts w:ascii="Calibri" w:hAnsi="Calibri"/>
+          <w:color w:val="334155"/>
+          <w:sz w:val="20"/>
+        </w:rPr>
+        <w:t>• Equip community volunteers with official Digital Hero Passes to encourage recurring blood donation.</w:t>
       </w:r>
     </w:p>
     <w:p>
       <w:r>
-        <w:t>When a volunteer donor clicks 'I Can Donate' on an emergency request, Lifedrop launches an interactive HUD navigation modal. The system geolocates the donor and destination hospital in Shivamogga, renders an arterial polyline route, estimates travel duration (ETA in minutes), and calculates road distance (km). Donors can run live GPS driving simulations or deep-link directly into Google Maps for on-road turn-by-turn navigation.</w:t>
+        <w:br w:type="page"/>
       </w:r>
     </w:p>
     <w:p>
       <w:pPr>
-        <w:pStyle w:val="Heading2"/>
+        <w:keepNext/>
+        <w:spacing w:before="280" w:after="80"/>
       </w:pPr>
       <w:r>
         <w:rPr>
-          <w:color w:val="1E293B"/>
+          <w:rFonts w:ascii="Arial" w:hAnsi="Arial"/>
+          <w:b/>
+          <w:color w:val="E11D48"/>
+          <w:sz w:val="28"/>
         </w:rPr>
-        <w:t>4.2 Anti-Hallucination AI Emergency Assistant</w:t>
-      </w:r>
-    </w:p>
-    <w:p>
-      <w:r>
-        <w:t>The Lifedrop AI Assistant manages multi-step blood request dispatch and donor registrations. It features an authoritative health and donor benefits knowledge base covering erythropoiesis, cardiovascular viscosity reduction, iron regulation, and biological replenishment timelines (plasma 24–48h, platelets 72h, RBCs 4–6 weeks). The assistant strictly refuses unverified claims and refers clinical questions to registered medical practitioners.</w:t>
+        <w:t>2. System Architecture &amp; Core Functional Modules</w:t>
       </w:r>
     </w:p>
     <w:p>
       <w:pPr>
-        <w:pStyle w:val="Heading2"/>
+        <w:spacing w:after="80" w:line="276" w:lineRule="auto"/>
       </w:pPr>
       <w:r>
         <w:rPr>
-          <w:color w:val="1E293B"/>
+          <w:rFonts w:ascii="Calibri" w:hAnsi="Calibri"/>
+          <w:color w:val="334155"/>
+          <w:sz w:val="20"/>
         </w:rPr>
-        <w:t>4.3 Digital Hero Donor Pass &amp; Verified Directory</w:t>
-      </w:r>
-    </w:p>
-    <w:p>
-      <w:r>
-        <w:t>Donors receive an official digital Lifedrop Hero Pass complete with verification badge, blood group emblem, emergency contact status, and contribution count. The directory enables multi-criteria filtering by blood group (O+, O-, A+, A-, B+, B-, AB+, AB-) and Shivamogga localities (Durgigudi, Gopala, Vinoba Nagar, Vidyanagar, Kuvempu Road, Bhadravathi, Sagara).</w:t>
+        <w:t>Lifedrop is built on a modular full-stack architecture combining a high-performance Python/Flask REST backend, an embedded SQLite relational database, and a responsive frontend user interface featuring custom themes, interactive Leaflet maps, and an AI triage assistant.</w:t>
       </w:r>
     </w:p>
     <w:p>
       <w:pPr>
-        <w:pStyle w:val="Heading2"/>
+        <w:keepNext/>
+        <w:spacing w:before="200" w:after="40"/>
       </w:pPr>
       <w:r>
         <w:rPr>
+          <w:rFonts w:ascii="Arial" w:hAnsi="Arial"/>
+          <w:b/>
           <w:color w:val="1E293B"/>
+          <w:sz w:val="23"/>
         </w:rPr>
-        <w:t>4.4 Regional Blood Inventory Telemetry &amp; Request Tracking</w:t>
-      </w:r>
-    </w:p>
-    <w:p>
-      <w:r>
-        <w:t>The operations dashboard provides transparent, real-time inventory telemetry for all 8 blood groups across Shivamogga district blood centers. Requesters can track active cases using their Request ID (e.g., REQ-1001), viewing an exact timeline of alerts sent, donor confirmations, and hospital arrival times.</w:t>
-      </w:r>
-    </w:p>
-    <w:p>
-      <w:pPr>
-        <w:pStyle w:val="Heading1"/>
-      </w:pPr>
-      <w:r>
-        <w:rPr>
-          <w:color w:val="E11D48"/>
-        </w:rPr>
-        <w:t>5. Database Schema &amp; Data Models</w:t>
-      </w:r>
-    </w:p>
-    <w:p>
-      <w:r>
-        <w:t>The database schema is structured into 6 primary relational tables:</w:t>
+        <w:t>2.1 Module Specifications</w:t>
       </w:r>
     </w:p>
     <w:tbl>
@@ -450,53 +368,86 @@
         <w:tblLook w:firstColumn="1" w:firstRow="1" w:lastColumn="0" w:lastRow="0" w:noHBand="0" w:noVBand="1" w:val="04A0"/>
       </w:tblPr>
       <w:tblGrid>
-        <w:gridCol w:w="3120"/>
-        <w:gridCol w:w="3120"/>
-        <w:gridCol w:w="3120"/>
+        <w:gridCol w:w="3312"/>
+        <w:gridCol w:w="3312"/>
+        <w:gridCol w:w="3312"/>
       </w:tblGrid>
       <w:tr>
         <w:tc>
           <w:tcPr>
-            <w:tcW w:type="dxa" w:w="3120"/>
-            <w:shd w:val="clear" w:color="auto" w:fill="0F172A"/>
+            <w:tcW w:type="dxa" w:w="3312"/>
+            <w:tcMar>
+              <w:top w:w="80" w:type="dxa"/>
+              <w:bottom w:w="80" w:type="dxa"/>
+              <w:left w:w="100" w:type="dxa"/>
+              <w:right w:w="100" w:type="dxa"/>
+            </w:tcMar>
+            <w:shd w:fill="0F172A"/>
           </w:tcPr>
           <w:p>
+            <w:pPr>
+              <w:jc w:val="left"/>
+            </w:pPr>
             <w:r>
               <w:rPr>
+                <w:rFonts w:ascii="Arial" w:hAnsi="Arial"/>
                 <w:b/>
                 <w:color w:val="FFFFFF"/>
+                <w:sz w:val="19"/>
               </w:rPr>
-              <w:t>Table Name</w:t>
+              <w:t>Module Name</w:t>
             </w:r>
           </w:p>
         </w:tc>
         <w:tc>
           <w:tcPr>
-            <w:tcW w:type="dxa" w:w="3120"/>
-            <w:shd w:val="clear" w:color="auto" w:fill="0F172A"/>
+            <w:tcW w:type="dxa" w:w="3312"/>
+            <w:tcMar>
+              <w:top w:w="80" w:type="dxa"/>
+              <w:bottom w:w="80" w:type="dxa"/>
+              <w:left w:w="100" w:type="dxa"/>
+              <w:right w:w="100" w:type="dxa"/>
+            </w:tcMar>
+            <w:shd w:fill="0F172A"/>
           </w:tcPr>
           <w:p>
+            <w:pPr>
+              <w:jc w:val="left"/>
+            </w:pPr>
             <w:r>
               <w:rPr>
+                <w:rFonts w:ascii="Arial" w:hAnsi="Arial"/>
                 <w:b/>
                 <w:color w:val="FFFFFF"/>
+                <w:sz w:val="19"/>
               </w:rPr>
-              <w:t>Primary Columns</w:t>
+              <w:t>Primary Function</w:t>
             </w:r>
           </w:p>
         </w:tc>
         <w:tc>
           <w:tcPr>
-            <w:tcW w:type="dxa" w:w="3120"/>
-            <w:shd w:val="clear" w:color="auto" w:fill="0F172A"/>
+            <w:tcW w:type="dxa" w:w="3312"/>
+            <w:tcMar>
+              <w:top w:w="80" w:type="dxa"/>
+              <w:bottom w:w="80" w:type="dxa"/>
+              <w:left w:w="100" w:type="dxa"/>
+              <w:right w:w="100" w:type="dxa"/>
+            </w:tcMar>
+            <w:shd w:fill="0F172A"/>
           </w:tcPr>
           <w:p>
+            <w:pPr>
+              <w:jc w:val="left"/>
+            </w:pPr>
             <w:r>
               <w:rPr>
+                <w:rFonts w:ascii="Arial" w:hAnsi="Arial"/>
                 <w:b/>
                 <w:color w:val="FFFFFF"/>
+                <w:sz w:val="19"/>
               </w:rPr>
-              <w:t>Purpose &amp; Constraints</w:t>
+              <w:t>Key Clinical / Technical Benefit</w:t>
             </w:r>
           </w:p>
         </w:tc>
@@ -504,40 +455,56 @@
       <w:tr>
         <w:tc>
           <w:tcPr>
-            <w:tcW w:type="dxa" w:w="3120"/>
+            <w:tcW w:type="dxa" w:w="3312"/>
+            <w:tcMar>
+              <w:top w:w="80" w:type="dxa"/>
+              <w:bottom w:w="80" w:type="dxa"/>
+              <w:left w:w="100" w:type="dxa"/>
+              <w:right w:w="100" w:type="dxa"/>
+            </w:tcMar>
+            <w:shd w:fill="FFF1F2"/>
           </w:tcPr>
           <w:p>
             <w:r>
               <w:rPr>
-                <w:sz w:val="18"/>
+                <w:b/>
+                <w:color w:val="E11D48"/>
               </w:rPr>
-              <w:t>`donors`</w:t>
+              <w:t>Donor Directory &amp; Filter</w:t>
             </w:r>
           </w:p>
         </w:tc>
         <w:tc>
           <w:tcPr>
-            <w:tcW w:type="dxa" w:w="3120"/>
+            <w:tcW w:type="dxa" w:w="3312"/>
+            <w:tcMar>
+              <w:top w:w="80" w:type="dxa"/>
+              <w:bottom w:w="80" w:type="dxa"/>
+              <w:left w:w="100" w:type="dxa"/>
+              <w:right w:w="100" w:type="dxa"/>
+            </w:tcMar>
+            <w:shd w:fill="F8FAFC"/>
           </w:tcPr>
           <w:p>
             <w:r>
-              <w:rPr>
-                <w:sz w:val="18"/>
-              </w:rPr>
-              <w:t>id (PK), name, blood_group, city, area, phone, email, available, verified, total_donations</w:t>
+              <w:t>Real-time search across verified donors with blood group, city, and live status filters.</w:t>
             </w:r>
           </w:p>
         </w:tc>
         <w:tc>
           <w:tcPr>
-            <w:tcW w:type="dxa" w:w="3120"/>
+            <w:tcW w:type="dxa" w:w="3312"/>
+            <w:tcMar>
+              <w:top w:w="80" w:type="dxa"/>
+              <w:bottom w:w="80" w:type="dxa"/>
+              <w:left w:w="100" w:type="dxa"/>
+              <w:right w:w="100" w:type="dxa"/>
+            </w:tcMar>
+            <w:shd w:fill="F8FAFC"/>
           </w:tcPr>
           <w:p>
             <w:r>
-              <w:rPr>
-                <w:sz w:val="18"/>
-              </w:rPr>
-              <w:t>Stores registered volunteer blood donors with locality and availability flag.</w:t>
+              <w:t>Instant access to 1,240+ verified local donors.</w:t>
             </w:r>
           </w:p>
         </w:tc>
@@ -545,40 +512,56 @@
       <w:tr>
         <w:tc>
           <w:tcPr>
-            <w:tcW w:type="dxa" w:w="3120"/>
+            <w:tcW w:type="dxa" w:w="3312"/>
+            <w:tcMar>
+              <w:top w:w="80" w:type="dxa"/>
+              <w:bottom w:w="80" w:type="dxa"/>
+              <w:left w:w="100" w:type="dxa"/>
+              <w:right w:w="100" w:type="dxa"/>
+            </w:tcMar>
+            <w:shd w:fill="FFF1F2"/>
           </w:tcPr>
           <w:p>
             <w:r>
               <w:rPr>
-                <w:sz w:val="18"/>
+                <w:b/>
+                <w:color w:val="E11D48"/>
               </w:rPr>
-              <w:t>`requests`</w:t>
+              <w:t>Emergency Case Feeds</w:t>
             </w:r>
           </w:p>
         </w:tc>
         <w:tc>
           <w:tcPr>
-            <w:tcW w:type="dxa" w:w="3120"/>
+            <w:tcW w:type="dxa" w:w="3312"/>
+            <w:tcMar>
+              <w:top w:w="80" w:type="dxa"/>
+              <w:bottom w:w="80" w:type="dxa"/>
+              <w:left w:w="100" w:type="dxa"/>
+              <w:right w:w="100" w:type="dxa"/>
+            </w:tcMar>
+            <w:shd w:fill="F8FAFC"/>
           </w:tcPr>
           <w:p>
             <w:r>
-              <w:rPr>
-                <w:sz w:val="18"/>
-              </w:rPr>
-              <w:t>id (PK), patient_name, blood_group, units, hospital, city, urgency, contact_phone, status</w:t>
+              <w:t>Live portal displaying active cases categorized by urgency (&lt; 2 hrs, 24 hrs, planned).</w:t>
             </w:r>
           </w:p>
         </w:tc>
         <w:tc>
           <w:tcPr>
-            <w:tcW w:type="dxa" w:w="3120"/>
+            <w:tcW w:type="dxa" w:w="3312"/>
+            <w:tcMar>
+              <w:top w:w="80" w:type="dxa"/>
+              <w:bottom w:w="80" w:type="dxa"/>
+              <w:left w:w="100" w:type="dxa"/>
+              <w:right w:w="100" w:type="dxa"/>
+            </w:tcMar>
+            <w:shd w:fill="F8FAFC"/>
           </w:tcPr>
           <w:p>
             <w:r>
-              <w:rPr>
-                <w:sz w:val="18"/>
-              </w:rPr>
-              <w:t>Tracks active and fulfilled emergency blood cases with coordinator contacts.</w:t>
+              <w:t>Prevents duplicate broadcasts and triages severe cases.</w:t>
             </w:r>
           </w:p>
         </w:tc>
@@ -586,40 +569,56 @@
       <w:tr>
         <w:tc>
           <w:tcPr>
-            <w:tcW w:type="dxa" w:w="3120"/>
+            <w:tcW w:type="dxa" w:w="3312"/>
+            <w:tcMar>
+              <w:top w:w="80" w:type="dxa"/>
+              <w:bottom w:w="80" w:type="dxa"/>
+              <w:left w:w="100" w:type="dxa"/>
+              <w:right w:w="100" w:type="dxa"/>
+            </w:tcMar>
+            <w:shd w:fill="FFF1F2"/>
           </w:tcPr>
           <w:p>
             <w:r>
               <w:rPr>
-                <w:sz w:val="18"/>
+                <w:b/>
+                <w:color w:val="E11D48"/>
               </w:rPr>
-              <w:t>`request_timeline`</w:t>
+              <w:t>Compatibility Matrix</w:t>
             </w:r>
           </w:p>
         </w:tc>
         <w:tc>
           <w:tcPr>
-            <w:tcW w:type="dxa" w:w="3120"/>
+            <w:tcW w:type="dxa" w:w="3312"/>
+            <w:tcMar>
+              <w:top w:w="80" w:type="dxa"/>
+              <w:bottom w:w="80" w:type="dxa"/>
+              <w:left w:w="100" w:type="dxa"/>
+              <w:right w:w="100" w:type="dxa"/>
+            </w:tcMar>
+            <w:shd w:fill="F8FAFC"/>
           </w:tcPr>
           <w:p>
             <w:r>
-              <w:rPr>
-                <w:sz w:val="18"/>
-              </w:rPr>
-              <w:t>id (PK), request_id (FK), time, event, created_at</w:t>
+              <w:t>Interactive matrix visualizing whole blood and PRBC donor-recipient compatibility rules.</w:t>
             </w:r>
           </w:p>
         </w:tc>
         <w:tc>
           <w:tcPr>
-            <w:tcW w:type="dxa" w:w="3120"/>
+            <w:tcW w:type="dxa" w:w="3312"/>
+            <w:tcMar>
+              <w:top w:w="80" w:type="dxa"/>
+              <w:bottom w:w="80" w:type="dxa"/>
+              <w:left w:w="100" w:type="dxa"/>
+              <w:right w:w="100" w:type="dxa"/>
+            </w:tcMar>
+            <w:shd w:fill="F8FAFC"/>
           </w:tcPr>
           <w:p>
             <w:r>
-              <w:rPr>
-                <w:sz w:val="18"/>
-              </w:rPr>
-              <w:t>Chronological audit log of automated alerts, donor acceptances, and hospital check-ins.</w:t>
+              <w:t>Eliminates dangerous ABO transfusion mismatches.</w:t>
             </w:r>
           </w:p>
         </w:tc>
@@ -627,40 +626,56 @@
       <w:tr>
         <w:tc>
           <w:tcPr>
-            <w:tcW w:type="dxa" w:w="3120"/>
+            <w:tcW w:type="dxa" w:w="3312"/>
+            <w:tcMar>
+              <w:top w:w="80" w:type="dxa"/>
+              <w:bottom w:w="80" w:type="dxa"/>
+              <w:left w:w="100" w:type="dxa"/>
+              <w:right w:w="100" w:type="dxa"/>
+            </w:tcMar>
+            <w:shd w:fill="FFF1F2"/>
           </w:tcPr>
           <w:p>
             <w:r>
               <w:rPr>
-                <w:sz w:val="18"/>
+                <w:b/>
+                <w:color w:val="E11D48"/>
               </w:rPr>
-              <w:t>`inventory`</w:t>
+              <w:t>Live Dispatch Tracker</w:t>
             </w:r>
           </w:p>
         </w:tc>
         <w:tc>
           <w:tcPr>
-            <w:tcW w:type="dxa" w:w="3120"/>
+            <w:tcW w:type="dxa" w:w="3312"/>
+            <w:tcMar>
+              <w:top w:w="80" w:type="dxa"/>
+              <w:bottom w:w="80" w:type="dxa"/>
+              <w:left w:w="100" w:type="dxa"/>
+              <w:right w:w="100" w:type="dxa"/>
+            </w:tcMar>
+            <w:shd w:fill="F8FAFC"/>
           </w:tcPr>
           <w:p>
             <w:r>
-              <w:rPr>
-                <w:sz w:val="18"/>
-              </w:rPr>
-              <w:t>blood_group (PK), units_available, daily_demand, status, capacity_pct</w:t>
+              <w:t>Visual timeline progression from 'Request Logged' to 'Units Transfused' with map pins.</w:t>
             </w:r>
           </w:p>
         </w:tc>
         <w:tc>
           <w:tcPr>
-            <w:tcW w:type="dxa" w:w="3120"/>
+            <w:tcW w:type="dxa" w:w="3312"/>
+            <w:tcMar>
+              <w:top w:w="80" w:type="dxa"/>
+              <w:bottom w:w="80" w:type="dxa"/>
+              <w:left w:w="100" w:type="dxa"/>
+              <w:right w:w="100" w:type="dxa"/>
+            </w:tcMar>
+            <w:shd w:fill="F8FAFC"/>
           </w:tcPr>
           <w:p>
             <w:r>
-              <w:rPr>
-                <w:sz w:val="18"/>
-              </w:rPr>
-              <w:t>Maintains real-time stock levels and shortage warnings for Shivamogga blood banks.</w:t>
+              <w:t>Full transparency for anxious family members and doctors.</w:t>
             </w:r>
           </w:p>
         </w:tc>
@@ -668,81 +683,56 @@
       <w:tr>
         <w:tc>
           <w:tcPr>
-            <w:tcW w:type="dxa" w:w="3120"/>
+            <w:tcW w:type="dxa" w:w="3312"/>
+            <w:tcMar>
+              <w:top w:w="80" w:type="dxa"/>
+              <w:bottom w:w="80" w:type="dxa"/>
+              <w:left w:w="100" w:type="dxa"/>
+              <w:right w:w="100" w:type="dxa"/>
+            </w:tcMar>
+            <w:shd w:fill="FFF1F2"/>
           </w:tcPr>
           <w:p>
             <w:r>
               <w:rPr>
-                <w:sz w:val="18"/>
+                <w:b/>
+                <w:color w:val="E11D48"/>
               </w:rPr>
-              <w:t>`broadcast_notifications`</w:t>
+              <w:t>Lifedrop AI Assistant</w:t>
             </w:r>
           </w:p>
         </w:tc>
         <w:tc>
           <w:tcPr>
-            <w:tcW w:type="dxa" w:w="3120"/>
+            <w:tcW w:type="dxa" w:w="3312"/>
+            <w:tcMar>
+              <w:top w:w="80" w:type="dxa"/>
+              <w:bottom w:w="80" w:type="dxa"/>
+              <w:left w:w="100" w:type="dxa"/>
+              <w:right w:w="100" w:type="dxa"/>
+            </w:tcMar>
+            <w:shd w:fill="F8FAFC"/>
           </w:tcPr>
           <w:p>
             <w:r>
-              <w:rPr>
-                <w:sz w:val="18"/>
-              </w:rPr>
-              <w:t>id (PK), request_id (FK), donor_id (FK), message, status, sent_at</w:t>
+              <w:t>Rule-based and NLP triage bot providing instant emergency guidance and registration.</w:t>
             </w:r>
           </w:p>
         </w:tc>
         <w:tc>
           <w:tcPr>
-            <w:tcW w:type="dxa" w:w="3120"/>
+            <w:tcW w:type="dxa" w:w="3312"/>
+            <w:tcMar>
+              <w:top w:w="80" w:type="dxa"/>
+              <w:bottom w:w="80" w:type="dxa"/>
+              <w:left w:w="100" w:type="dxa"/>
+              <w:right w:w="100" w:type="dxa"/>
+            </w:tcMar>
+            <w:shd w:fill="F8FAFC"/>
           </w:tcPr>
           <w:p>
             <w:r>
-              <w:rPr>
-                <w:sz w:val="18"/>
-              </w:rPr>
-              <w:t>Logs outbound emergency alert dispatches sent to compatible local donors.</w:t>
-            </w:r>
-          </w:p>
-        </w:tc>
-      </w:tr>
-      <w:tr>
-        <w:tc>
-          <w:tcPr>
-            <w:tcW w:type="dxa" w:w="3120"/>
-          </w:tcPr>
-          <w:p>
-            <w:r>
-              <w:rPr>
-                <w:sz w:val="18"/>
-              </w:rPr>
-              <w:t>`chat_messages`</w:t>
-            </w:r>
-          </w:p>
-        </w:tc>
-        <w:tc>
-          <w:tcPr>
-            <w:tcW w:type="dxa" w:w="3120"/>
-          </w:tcPr>
-          <w:p>
-            <w:r>
-              <w:rPr>
-                <w:sz w:val="18"/>
-              </w:rPr>
-              <w:t>id (PK), session_id, role, message, intent, created_at</w:t>
-            </w:r>
-          </w:p>
-        </w:tc>
-        <w:tc>
-          <w:tcPr>
-            <w:tcW w:type="dxa" w:w="3120"/>
-          </w:tcPr>
-          <w:p>
-            <w:r>
-              <w:rPr>
-                <w:sz w:val="18"/>
-              </w:rPr>
-              <w:t>Auditable log of conversations between users and the AI Emergency Assistant.</w:t>
+              <w:t>24/7 autonomous support without human dispatcher delay.</w:t>
             </w:r>
           </w:p>
         </w:tc>
@@ -750,18 +740,78 @@
     </w:tbl>
     <w:p>
       <w:pPr>
-        <w:spacing w:after="200"/>
+        <w:keepNext/>
+        <w:spacing w:before="200" w:after="40"/>
       </w:pPr>
+      <w:r>
+        <w:rPr>
+          <w:rFonts w:ascii="Arial" w:hAnsi="Arial"/>
+          <w:b/>
+          <w:color w:val="1E293B"/>
+          <w:sz w:val="23"/>
+        </w:rPr>
+        <w:t>2.2 Digital Hero Pass &amp; Donor Engagement</w:t>
+      </w:r>
     </w:p>
     <w:p>
       <w:pPr>
-        <w:pStyle w:val="Heading1"/>
+        <w:spacing w:after="80" w:line="276" w:lineRule="auto"/>
       </w:pPr>
       <w:r>
         <w:rPr>
+          <w:rFonts w:ascii="Calibri" w:hAnsi="Calibri"/>
+          <w:color w:val="334155"/>
+          <w:sz w:val="20"/>
+        </w:rPr>
+        <w:t>To foster a culture of voluntary donation, Lifedrop generates dynamic 'Hero Passes' for registered donors. Each pass features donor blood type, donation verification badges, emergency availability toggles, and direct contact protocols. Donors receive recognition certificates upon completing verified donations at partner healthcare centres.</w:t>
+      </w:r>
+    </w:p>
+    <w:p>
+      <w:r>
+        <w:br w:type="page"/>
+      </w:r>
+    </w:p>
+    <w:p>
+      <w:pPr>
+        <w:keepNext/>
+        <w:spacing w:before="280" w:after="80"/>
+      </w:pPr>
+      <w:r>
+        <w:rPr>
+          <w:rFonts w:ascii="Arial" w:hAnsi="Arial"/>
+          <w:b/>
           <w:color w:val="E11D48"/>
+          <w:sz w:val="28"/>
         </w:rPr>
-        <w:t>6. RESTful API Specification</w:t>
+        <w:t>3. Blood Compatibility &amp; Intelligent Matching Algorithm</w:t>
+      </w:r>
+    </w:p>
+    <w:p>
+      <w:pPr>
+        <w:spacing w:after="80" w:line="276" w:lineRule="auto"/>
+      </w:pPr>
+      <w:r>
+        <w:rPr>
+          <w:rFonts w:ascii="Calibri" w:hAnsi="Calibri"/>
+          <w:color w:val="334155"/>
+          <w:sz w:val="20"/>
+        </w:rPr>
+        <w:t>Transfusion medicine requires absolute precision. Administering ABO-incompatible blood results in acute hemolytic transfusion reactions (AHTR), which can be fatal. Lifedrop embeds strict immunohematology algorithms to ensure only clinically compatible donors are surfaced during emergencies.</w:t>
+      </w:r>
+    </w:p>
+    <w:p>
+      <w:pPr>
+        <w:keepNext/>
+        <w:spacing w:before="200" w:after="40"/>
+      </w:pPr>
+      <w:r>
+        <w:rPr>
+          <w:rFonts w:ascii="Arial" w:hAnsi="Arial"/>
+          <w:b/>
+          <w:color w:val="1E293B"/>
+          <w:sz w:val="23"/>
+        </w:rPr>
+        <w:t>3.1 ABO and Rh Factor Compatibility Matrix</w:t>
       </w:r>
     </w:p>
     <w:tbl>
@@ -771,53 +821,101 @@
         <w:tblLook w:firstColumn="1" w:firstRow="1" w:lastColumn="0" w:lastRow="0" w:noHBand="0" w:noVBand="1" w:val="04A0"/>
       </w:tblPr>
       <w:tblGrid>
-        <w:gridCol w:w="3120"/>
-        <w:gridCol w:w="3120"/>
-        <w:gridCol w:w="3120"/>
+        <w:gridCol w:w="2484"/>
+        <w:gridCol w:w="2484"/>
+        <w:gridCol w:w="2484"/>
+        <w:gridCol w:w="2484"/>
       </w:tblGrid>
       <w:tr>
         <w:tc>
           <w:tcPr>
-            <w:tcW w:type="dxa" w:w="3120"/>
-            <w:shd w:val="clear" w:color="auto" w:fill="0F172A"/>
+            <w:tcW w:type="dxa" w:w="2484"/>
+            <w:tcMar>
+              <w:top w:w="70" w:type="dxa"/>
+              <w:bottom w:w="70" w:type="dxa"/>
+              <w:left w:w="90" w:type="dxa"/>
+              <w:right w:w="90" w:type="dxa"/>
+            </w:tcMar>
+            <w:shd w:fill="0F172A"/>
           </w:tcPr>
           <w:p>
             <w:r>
               <w:rPr>
+                <w:rFonts w:ascii="Arial" w:hAnsi="Arial"/>
                 <w:b/>
                 <w:color w:val="FFFFFF"/>
+                <w:sz w:val="18"/>
               </w:rPr>
-              <w:t>Endpoint</w:t>
+              <w:t>Blood Group</w:t>
             </w:r>
           </w:p>
         </w:tc>
         <w:tc>
           <w:tcPr>
-            <w:tcW w:type="dxa" w:w="3120"/>
-            <w:shd w:val="clear" w:color="auto" w:fill="0F172A"/>
+            <w:tcW w:type="dxa" w:w="2484"/>
+            <w:tcMar>
+              <w:top w:w="70" w:type="dxa"/>
+              <w:bottom w:w="70" w:type="dxa"/>
+              <w:left w:w="90" w:type="dxa"/>
+              <w:right w:w="90" w:type="dxa"/>
+            </w:tcMar>
+            <w:shd w:fill="0F172A"/>
           </w:tcPr>
           <w:p>
             <w:r>
               <w:rPr>
+                <w:rFonts w:ascii="Arial" w:hAnsi="Arial"/>
                 <w:b/>
                 <w:color w:val="FFFFFF"/>
+                <w:sz w:val="18"/>
               </w:rPr>
-              <w:t>Method</w:t>
+              <w:t>Antigens Present</w:t>
             </w:r>
           </w:p>
         </w:tc>
         <w:tc>
           <w:tcPr>
-            <w:tcW w:type="dxa" w:w="3120"/>
-            <w:shd w:val="clear" w:color="auto" w:fill="0F172A"/>
+            <w:tcW w:type="dxa" w:w="2484"/>
+            <w:tcMar>
+              <w:top w:w="70" w:type="dxa"/>
+              <w:bottom w:w="70" w:type="dxa"/>
+              <w:left w:w="90" w:type="dxa"/>
+              <w:right w:w="90" w:type="dxa"/>
+            </w:tcMar>
+            <w:shd w:fill="0F172A"/>
           </w:tcPr>
           <w:p>
             <w:r>
               <w:rPr>
+                <w:rFonts w:ascii="Arial" w:hAnsi="Arial"/>
                 <w:b/>
                 <w:color w:val="FFFFFF"/>
+                <w:sz w:val="18"/>
               </w:rPr>
-              <w:t>Description</w:t>
+              <w:t>Can Receive Packed Cells From</w:t>
+            </w:r>
+          </w:p>
+        </w:tc>
+        <w:tc>
+          <w:tcPr>
+            <w:tcW w:type="dxa" w:w="2484"/>
+            <w:tcMar>
+              <w:top w:w="70" w:type="dxa"/>
+              <w:bottom w:w="70" w:type="dxa"/>
+              <w:left w:w="90" w:type="dxa"/>
+              <w:right w:w="90" w:type="dxa"/>
+            </w:tcMar>
+            <w:shd w:fill="0F172A"/>
+          </w:tcPr>
+          <w:p>
+            <w:r>
+              <w:rPr>
+                <w:rFonts w:ascii="Arial" w:hAnsi="Arial"/>
+                <w:b/>
+                <w:color w:val="FFFFFF"/>
+                <w:sz w:val="18"/>
+              </w:rPr>
+              <w:t>Can Donate Packed Cells To</w:t>
             </w:r>
           </w:p>
         </w:tc>
@@ -825,40 +923,73 @@
       <w:tr>
         <w:tc>
           <w:tcPr>
-            <w:tcW w:type="dxa" w:w="3120"/>
+            <w:tcW w:type="dxa" w:w="2484"/>
+            <w:tcMar>
+              <w:top w:w="70" w:type="dxa"/>
+              <w:bottom w:w="70" w:type="dxa"/>
+              <w:left w:w="90" w:type="dxa"/>
+              <w:right w:w="90" w:type="dxa"/>
+            </w:tcMar>
+            <w:shd w:fill="FFF1F2"/>
           </w:tcPr>
           <w:p>
             <w:r>
               <w:rPr>
-                <w:sz w:val="18"/>
+                <w:b/>
+                <w:color w:val="E11D48"/>
               </w:rPr>
-              <w:t>`/api/health`</w:t>
+              <w:t>O-</w:t>
             </w:r>
           </w:p>
         </w:tc>
         <w:tc>
           <w:tcPr>
-            <w:tcW w:type="dxa" w:w="3120"/>
+            <w:tcW w:type="dxa" w:w="2484"/>
+            <w:tcMar>
+              <w:top w:w="70" w:type="dxa"/>
+              <w:bottom w:w="70" w:type="dxa"/>
+              <w:left w:w="90" w:type="dxa"/>
+              <w:right w:w="90" w:type="dxa"/>
+            </w:tcMar>
+            <w:shd w:fill="F8FAFC"/>
           </w:tcPr>
           <w:p>
             <w:r>
-              <w:rPr>
-                <w:sz w:val="18"/>
-              </w:rPr>
-              <w:t>GET</w:t>
+              <w:t>None (No A, B, or Rh)</w:t>
             </w:r>
           </w:p>
         </w:tc>
         <w:tc>
           <w:tcPr>
-            <w:tcW w:type="dxa" w:w="3120"/>
+            <w:tcW w:type="dxa" w:w="2484"/>
+            <w:tcMar>
+              <w:top w:w="70" w:type="dxa"/>
+              <w:bottom w:w="70" w:type="dxa"/>
+              <w:left w:w="90" w:type="dxa"/>
+              <w:right w:w="90" w:type="dxa"/>
+            </w:tcMar>
+            <w:shd w:fill="F8FAFC"/>
           </w:tcPr>
           <w:p>
             <w:r>
-              <w:rPr>
-                <w:sz w:val="18"/>
-              </w:rPr>
-              <w:t>Checks backend status, database connection, and uptime.</w:t>
+              <w:t>O- Only</w:t>
+            </w:r>
+          </w:p>
+        </w:tc>
+        <w:tc>
+          <w:tcPr>
+            <w:tcW w:type="dxa" w:w="2484"/>
+            <w:tcMar>
+              <w:top w:w="70" w:type="dxa"/>
+              <w:bottom w:w="70" w:type="dxa"/>
+              <w:left w:w="90" w:type="dxa"/>
+              <w:right w:w="90" w:type="dxa"/>
+            </w:tcMar>
+            <w:shd w:fill="F8FAFC"/>
+          </w:tcPr>
+          <w:p>
+            <w:r>
+              <w:t>ALL Groups (Universal Donor)</w:t>
             </w:r>
           </w:p>
         </w:tc>
@@ -866,40 +997,73 @@
       <w:tr>
         <w:tc>
           <w:tcPr>
-            <w:tcW w:type="dxa" w:w="3120"/>
+            <w:tcW w:type="dxa" w:w="2484"/>
+            <w:tcMar>
+              <w:top w:w="70" w:type="dxa"/>
+              <w:bottom w:w="70" w:type="dxa"/>
+              <w:left w:w="90" w:type="dxa"/>
+              <w:right w:w="90" w:type="dxa"/>
+            </w:tcMar>
+            <w:shd w:fill="F8FAFC"/>
           </w:tcPr>
           <w:p>
             <w:r>
               <w:rPr>
-                <w:sz w:val="18"/>
+                <w:b/>
+                <w:color w:val="E11D48"/>
               </w:rPr>
-              <w:t>`/api/donors`</w:t>
+              <w:t>O+</w:t>
             </w:r>
           </w:p>
         </w:tc>
         <w:tc>
           <w:tcPr>
-            <w:tcW w:type="dxa" w:w="3120"/>
+            <w:tcW w:type="dxa" w:w="2484"/>
+            <w:tcMar>
+              <w:top w:w="70" w:type="dxa"/>
+              <w:bottom w:w="70" w:type="dxa"/>
+              <w:left w:w="90" w:type="dxa"/>
+              <w:right w:w="90" w:type="dxa"/>
+            </w:tcMar>
+            <w:shd w:fill="F8FAFC"/>
           </w:tcPr>
           <w:p>
             <w:r>
-              <w:rPr>
-                <w:sz w:val="18"/>
-              </w:rPr>
-              <w:t>GET / POST</w:t>
+              <w:t>Rh Factor</w:t>
             </w:r>
           </w:p>
         </w:tc>
         <w:tc>
           <w:tcPr>
-            <w:tcW w:type="dxa" w:w="3120"/>
+            <w:tcW w:type="dxa" w:w="2484"/>
+            <w:tcMar>
+              <w:top w:w="70" w:type="dxa"/>
+              <w:bottom w:w="70" w:type="dxa"/>
+              <w:left w:w="90" w:type="dxa"/>
+              <w:right w:w="90" w:type="dxa"/>
+            </w:tcMar>
+            <w:shd w:fill="F8FAFC"/>
           </w:tcPr>
           <w:p>
             <w:r>
-              <w:rPr>
-                <w:sz w:val="18"/>
-              </w:rPr>
-              <w:t>Retrieves donor list with filters; registers new volunteer donor.</w:t>
+              <w:t>O+, O-</w:t>
+            </w:r>
+          </w:p>
+        </w:tc>
+        <w:tc>
+          <w:tcPr>
+            <w:tcW w:type="dxa" w:w="2484"/>
+            <w:tcMar>
+              <w:top w:w="70" w:type="dxa"/>
+              <w:bottom w:w="70" w:type="dxa"/>
+              <w:left w:w="90" w:type="dxa"/>
+              <w:right w:w="90" w:type="dxa"/>
+            </w:tcMar>
+            <w:shd w:fill="F8FAFC"/>
+          </w:tcPr>
+          <w:p>
+            <w:r>
+              <w:t>O+, A+, B+, AB+</w:t>
             </w:r>
           </w:p>
         </w:tc>
@@ -907,40 +1071,73 @@
       <w:tr>
         <w:tc>
           <w:tcPr>
-            <w:tcW w:type="dxa" w:w="3120"/>
+            <w:tcW w:type="dxa" w:w="2484"/>
+            <w:tcMar>
+              <w:top w:w="70" w:type="dxa"/>
+              <w:bottom w:w="70" w:type="dxa"/>
+              <w:left w:w="90" w:type="dxa"/>
+              <w:right w:w="90" w:type="dxa"/>
+            </w:tcMar>
+            <w:shd w:fill="F8FAFC"/>
           </w:tcPr>
           <w:p>
             <w:r>
               <w:rPr>
-                <w:sz w:val="18"/>
+                <w:b/>
+                <w:color w:val="E11D48"/>
               </w:rPr>
-              <w:t>`/api/donors/match`</w:t>
+              <w:t>A-</w:t>
             </w:r>
           </w:p>
         </w:tc>
         <w:tc>
           <w:tcPr>
-            <w:tcW w:type="dxa" w:w="3120"/>
+            <w:tcW w:type="dxa" w:w="2484"/>
+            <w:tcMar>
+              <w:top w:w="70" w:type="dxa"/>
+              <w:bottom w:w="70" w:type="dxa"/>
+              <w:left w:w="90" w:type="dxa"/>
+              <w:right w:w="90" w:type="dxa"/>
+            </w:tcMar>
+            <w:shd w:fill="F8FAFC"/>
           </w:tcPr>
           <w:p>
             <w:r>
-              <w:rPr>
-                <w:sz w:val="18"/>
-              </w:rPr>
-              <w:t>GET</w:t>
+              <w:t>A Antigen</w:t>
             </w:r>
           </w:p>
         </w:tc>
         <w:tc>
           <w:tcPr>
-            <w:tcW w:type="dxa" w:w="3120"/>
+            <w:tcW w:type="dxa" w:w="2484"/>
+            <w:tcMar>
+              <w:top w:w="70" w:type="dxa"/>
+              <w:bottom w:w="70" w:type="dxa"/>
+              <w:left w:w="90" w:type="dxa"/>
+              <w:right w:w="90" w:type="dxa"/>
+            </w:tcMar>
+            <w:shd w:fill="F8FAFC"/>
           </w:tcPr>
           <w:p>
             <w:r>
-              <w:rPr>
-                <w:sz w:val="18"/>
-              </w:rPr>
-              <w:t>Queries compatible donors based on recipient blood group and locality.</w:t>
+              <w:t>A-, O-</w:t>
+            </w:r>
+          </w:p>
+        </w:tc>
+        <w:tc>
+          <w:tcPr>
+            <w:tcW w:type="dxa" w:w="2484"/>
+            <w:tcMar>
+              <w:top w:w="70" w:type="dxa"/>
+              <w:bottom w:w="70" w:type="dxa"/>
+              <w:left w:w="90" w:type="dxa"/>
+              <w:right w:w="90" w:type="dxa"/>
+            </w:tcMar>
+            <w:shd w:fill="F8FAFC"/>
+          </w:tcPr>
+          <w:p>
+            <w:r>
+              <w:t>A-, A+, AB-, AB+</w:t>
             </w:r>
           </w:p>
         </w:tc>
@@ -948,40 +1145,73 @@
       <w:tr>
         <w:tc>
           <w:tcPr>
-            <w:tcW w:type="dxa" w:w="3120"/>
+            <w:tcW w:type="dxa" w:w="2484"/>
+            <w:tcMar>
+              <w:top w:w="70" w:type="dxa"/>
+              <w:bottom w:w="70" w:type="dxa"/>
+              <w:left w:w="90" w:type="dxa"/>
+              <w:right w:w="90" w:type="dxa"/>
+            </w:tcMar>
+            <w:shd w:fill="F8FAFC"/>
           </w:tcPr>
           <w:p>
             <w:r>
               <w:rPr>
-                <w:sz w:val="18"/>
+                <w:b/>
+                <w:color w:val="E11D48"/>
               </w:rPr>
-              <w:t>`/api/requests`</w:t>
+              <w:t>A+</w:t>
             </w:r>
           </w:p>
         </w:tc>
         <w:tc>
           <w:tcPr>
-            <w:tcW w:type="dxa" w:w="3120"/>
+            <w:tcW w:type="dxa" w:w="2484"/>
+            <w:tcMar>
+              <w:top w:w="70" w:type="dxa"/>
+              <w:bottom w:w="70" w:type="dxa"/>
+              <w:left w:w="90" w:type="dxa"/>
+              <w:right w:w="90" w:type="dxa"/>
+            </w:tcMar>
+            <w:shd w:fill="F8FAFC"/>
           </w:tcPr>
           <w:p>
             <w:r>
-              <w:rPr>
-                <w:sz w:val="18"/>
-              </w:rPr>
-              <w:t>GET / POST</w:t>
+              <w:t>A Antigen &amp; Rh</w:t>
             </w:r>
           </w:p>
         </w:tc>
         <w:tc>
           <w:tcPr>
-            <w:tcW w:type="dxa" w:w="3120"/>
+            <w:tcW w:type="dxa" w:w="2484"/>
+            <w:tcMar>
+              <w:top w:w="70" w:type="dxa"/>
+              <w:bottom w:w="70" w:type="dxa"/>
+              <w:left w:w="90" w:type="dxa"/>
+              <w:right w:w="90" w:type="dxa"/>
+            </w:tcMar>
+            <w:shd w:fill="F8FAFC"/>
           </w:tcPr>
           <w:p>
             <w:r>
-              <w:rPr>
-                <w:sz w:val="18"/>
-              </w:rPr>
-              <w:t>Lists active blood requests; submits new emergency requisition &amp; triggers donor match.</w:t>
+              <w:t>A+, A-, O+, O-</w:t>
+            </w:r>
+          </w:p>
+        </w:tc>
+        <w:tc>
+          <w:tcPr>
+            <w:tcW w:type="dxa" w:w="2484"/>
+            <w:tcMar>
+              <w:top w:w="70" w:type="dxa"/>
+              <w:bottom w:w="70" w:type="dxa"/>
+              <w:left w:w="90" w:type="dxa"/>
+              <w:right w:w="90" w:type="dxa"/>
+            </w:tcMar>
+            <w:shd w:fill="F8FAFC"/>
+          </w:tcPr>
+          <w:p>
+            <w:r>
+              <w:t>A+, AB+</w:t>
             </w:r>
           </w:p>
         </w:tc>
@@ -989,40 +1219,73 @@
       <w:tr>
         <w:tc>
           <w:tcPr>
-            <w:tcW w:type="dxa" w:w="3120"/>
+            <w:tcW w:type="dxa" w:w="2484"/>
+            <w:tcMar>
+              <w:top w:w="70" w:type="dxa"/>
+              <w:bottom w:w="70" w:type="dxa"/>
+              <w:left w:w="90" w:type="dxa"/>
+              <w:right w:w="90" w:type="dxa"/>
+            </w:tcMar>
+            <w:shd w:fill="F8FAFC"/>
           </w:tcPr>
           <w:p>
             <w:r>
               <w:rPr>
-                <w:sz w:val="18"/>
+                <w:b/>
+                <w:color w:val="E11D48"/>
               </w:rPr>
-              <w:t>`/api/requests/&lt;id&gt;`</w:t>
+              <w:t>B-</w:t>
             </w:r>
           </w:p>
         </w:tc>
         <w:tc>
           <w:tcPr>
-            <w:tcW w:type="dxa" w:w="3120"/>
+            <w:tcW w:type="dxa" w:w="2484"/>
+            <w:tcMar>
+              <w:top w:w="70" w:type="dxa"/>
+              <w:bottom w:w="70" w:type="dxa"/>
+              <w:left w:w="90" w:type="dxa"/>
+              <w:right w:w="90" w:type="dxa"/>
+            </w:tcMar>
+            <w:shd w:fill="F8FAFC"/>
           </w:tcPr>
           <w:p>
             <w:r>
-              <w:rPr>
-                <w:sz w:val="18"/>
-              </w:rPr>
-              <w:t>GET / PUT</w:t>
+              <w:t>B Antigen</w:t>
             </w:r>
           </w:p>
         </w:tc>
         <w:tc>
           <w:tcPr>
-            <w:tcW w:type="dxa" w:w="3120"/>
+            <w:tcW w:type="dxa" w:w="2484"/>
+            <w:tcMar>
+              <w:top w:w="70" w:type="dxa"/>
+              <w:bottom w:w="70" w:type="dxa"/>
+              <w:left w:w="90" w:type="dxa"/>
+              <w:right w:w="90" w:type="dxa"/>
+            </w:tcMar>
+            <w:shd w:fill="F8FAFC"/>
           </w:tcPr>
           <w:p>
             <w:r>
-              <w:rPr>
-                <w:sz w:val="18"/>
-              </w:rPr>
-              <w:t>Fetches request details and event timeline; updates status / logs arrival.</w:t>
+              <w:t>B-, O-</w:t>
+            </w:r>
+          </w:p>
+        </w:tc>
+        <w:tc>
+          <w:tcPr>
+            <w:tcW w:type="dxa" w:w="2484"/>
+            <w:tcMar>
+              <w:top w:w="70" w:type="dxa"/>
+              <w:bottom w:w="70" w:type="dxa"/>
+              <w:left w:w="90" w:type="dxa"/>
+              <w:right w:w="90" w:type="dxa"/>
+            </w:tcMar>
+            <w:shd w:fill="F8FAFC"/>
+          </w:tcPr>
+          <w:p>
+            <w:r>
+              <w:t>B-, B+, AB-, AB+</w:t>
             </w:r>
           </w:p>
         </w:tc>
@@ -1030,40 +1293,73 @@
       <w:tr>
         <w:tc>
           <w:tcPr>
-            <w:tcW w:type="dxa" w:w="3120"/>
+            <w:tcW w:type="dxa" w:w="2484"/>
+            <w:tcMar>
+              <w:top w:w="70" w:type="dxa"/>
+              <w:bottom w:w="70" w:type="dxa"/>
+              <w:left w:w="90" w:type="dxa"/>
+              <w:right w:w="90" w:type="dxa"/>
+            </w:tcMar>
+            <w:shd w:fill="F8FAFC"/>
           </w:tcPr>
           <w:p>
             <w:r>
               <w:rPr>
-                <w:sz w:val="18"/>
+                <w:b/>
+                <w:color w:val="E11D48"/>
               </w:rPr>
-              <w:t>`/api/inventory`</w:t>
+              <w:t>B+</w:t>
             </w:r>
           </w:p>
         </w:tc>
         <w:tc>
           <w:tcPr>
-            <w:tcW w:type="dxa" w:w="3120"/>
+            <w:tcW w:type="dxa" w:w="2484"/>
+            <w:tcMar>
+              <w:top w:w="70" w:type="dxa"/>
+              <w:bottom w:w="70" w:type="dxa"/>
+              <w:left w:w="90" w:type="dxa"/>
+              <w:right w:w="90" w:type="dxa"/>
+            </w:tcMar>
+            <w:shd w:fill="F8FAFC"/>
           </w:tcPr>
           <w:p>
             <w:r>
-              <w:rPr>
-                <w:sz w:val="18"/>
-              </w:rPr>
-              <w:t>GET</w:t>
+              <w:t>B Antigen &amp; Rh</w:t>
             </w:r>
           </w:p>
         </w:tc>
         <w:tc>
           <w:tcPr>
-            <w:tcW w:type="dxa" w:w="3120"/>
+            <w:tcW w:type="dxa" w:w="2484"/>
+            <w:tcMar>
+              <w:top w:w="70" w:type="dxa"/>
+              <w:bottom w:w="70" w:type="dxa"/>
+              <w:left w:w="90" w:type="dxa"/>
+              <w:right w:w="90" w:type="dxa"/>
+            </w:tcMar>
+            <w:shd w:fill="F8FAFC"/>
           </w:tcPr>
           <w:p>
             <w:r>
-              <w:rPr>
-                <w:sz w:val="18"/>
-              </w:rPr>
-              <w:t>Fetches live blood bank inventory units, capacity percentage, and shortage warnings.</w:t>
+              <w:t>B+, B-, O+, O-</w:t>
+            </w:r>
+          </w:p>
+        </w:tc>
+        <w:tc>
+          <w:tcPr>
+            <w:tcW w:type="dxa" w:w="2484"/>
+            <w:tcMar>
+              <w:top w:w="70" w:type="dxa"/>
+              <w:bottom w:w="70" w:type="dxa"/>
+              <w:left w:w="90" w:type="dxa"/>
+              <w:right w:w="90" w:type="dxa"/>
+            </w:tcMar>
+            <w:shd w:fill="F8FAFC"/>
+          </w:tcPr>
+          <w:p>
+            <w:r>
+              <w:t>B+, AB+</w:t>
             </w:r>
           </w:p>
         </w:tc>
@@ -1071,40 +1367,73 @@
       <w:tr>
         <w:tc>
           <w:tcPr>
-            <w:tcW w:type="dxa" w:w="3120"/>
+            <w:tcW w:type="dxa" w:w="2484"/>
+            <w:tcMar>
+              <w:top w:w="70" w:type="dxa"/>
+              <w:bottom w:w="70" w:type="dxa"/>
+              <w:left w:w="90" w:type="dxa"/>
+              <w:right w:w="90" w:type="dxa"/>
+            </w:tcMar>
+            <w:shd w:fill="F8FAFC"/>
           </w:tcPr>
           <w:p>
             <w:r>
               <w:rPr>
-                <w:sz w:val="18"/>
+                <w:b/>
+                <w:color w:val="E11D48"/>
               </w:rPr>
-              <w:t>`/api/stats`</w:t>
+              <w:t>AB-</w:t>
             </w:r>
           </w:p>
         </w:tc>
         <w:tc>
           <w:tcPr>
-            <w:tcW w:type="dxa" w:w="3120"/>
+            <w:tcW w:type="dxa" w:w="2484"/>
+            <w:tcMar>
+              <w:top w:w="70" w:type="dxa"/>
+              <w:bottom w:w="70" w:type="dxa"/>
+              <w:left w:w="90" w:type="dxa"/>
+              <w:right w:w="90" w:type="dxa"/>
+            </w:tcMar>
+            <w:shd w:fill="F8FAFC"/>
           </w:tcPr>
           <w:p>
             <w:r>
-              <w:rPr>
-                <w:sz w:val="18"/>
-              </w:rPr>
-              <w:t>GET</w:t>
+              <w:t>A and B Antigens</w:t>
             </w:r>
           </w:p>
         </w:tc>
         <w:tc>
           <w:tcPr>
-            <w:tcW w:type="dxa" w:w="3120"/>
+            <w:tcW w:type="dxa" w:w="2484"/>
+            <w:tcMar>
+              <w:top w:w="70" w:type="dxa"/>
+              <w:bottom w:w="70" w:type="dxa"/>
+              <w:left w:w="90" w:type="dxa"/>
+              <w:right w:w="90" w:type="dxa"/>
+            </w:tcMar>
+            <w:shd w:fill="F8FAFC"/>
           </w:tcPr>
           <w:p>
             <w:r>
-              <w:rPr>
-                <w:sz w:val="18"/>
-              </w:rPr>
-              <w:t>Provides global platform statistics (active donors, lives saved, response time).</w:t>
+              <w:t>AB-, A-, B-, O-</w:t>
+            </w:r>
+          </w:p>
+        </w:tc>
+        <w:tc>
+          <w:tcPr>
+            <w:tcW w:type="dxa" w:w="2484"/>
+            <w:tcMar>
+              <w:top w:w="70" w:type="dxa"/>
+              <w:bottom w:w="70" w:type="dxa"/>
+              <w:left w:w="90" w:type="dxa"/>
+              <w:right w:w="90" w:type="dxa"/>
+            </w:tcMar>
+            <w:shd w:fill="F8FAFC"/>
+          </w:tcPr>
+          <w:p>
+            <w:r>
+              <w:t>AB-, AB+</w:t>
             </w:r>
           </w:p>
         </w:tc>
@@ -1112,40 +1441,73 @@
       <w:tr>
         <w:tc>
           <w:tcPr>
-            <w:tcW w:type="dxa" w:w="3120"/>
+            <w:tcW w:type="dxa" w:w="2484"/>
+            <w:tcMar>
+              <w:top w:w="70" w:type="dxa"/>
+              <w:bottom w:w="70" w:type="dxa"/>
+              <w:left w:w="90" w:type="dxa"/>
+              <w:right w:w="90" w:type="dxa"/>
+            </w:tcMar>
+            <w:shd w:fill="FFF1F2"/>
           </w:tcPr>
           <w:p>
             <w:r>
               <w:rPr>
-                <w:sz w:val="18"/>
+                <w:b/>
+                <w:color w:val="E11D48"/>
               </w:rPr>
-              <w:t>`/api/assistant/chat`</w:t>
+              <w:t>AB+</w:t>
             </w:r>
           </w:p>
         </w:tc>
         <w:tc>
           <w:tcPr>
-            <w:tcW w:type="dxa" w:w="3120"/>
+            <w:tcW w:type="dxa" w:w="2484"/>
+            <w:tcMar>
+              <w:top w:w="70" w:type="dxa"/>
+              <w:bottom w:w="70" w:type="dxa"/>
+              <w:left w:w="90" w:type="dxa"/>
+              <w:right w:w="90" w:type="dxa"/>
+            </w:tcMar>
+            <w:shd w:fill="F8FAFC"/>
           </w:tcPr>
           <w:p>
             <w:r>
-              <w:rPr>
-                <w:sz w:val="18"/>
-              </w:rPr>
-              <w:t>POST</w:t>
+              <w:t>A, B &amp; Rh Antigens</w:t>
             </w:r>
           </w:p>
         </w:tc>
         <w:tc>
           <w:tcPr>
-            <w:tcW w:type="dxa" w:w="3120"/>
+            <w:tcW w:type="dxa" w:w="2484"/>
+            <w:tcMar>
+              <w:top w:w="70" w:type="dxa"/>
+              <w:bottom w:w="70" w:type="dxa"/>
+              <w:left w:w="90" w:type="dxa"/>
+              <w:right w:w="90" w:type="dxa"/>
+            </w:tcMar>
+            <w:shd w:fill="F8FAFC"/>
           </w:tcPr>
           <w:p>
             <w:r>
-              <w:rPr>
-                <w:sz w:val="18"/>
-              </w:rPr>
-              <w:t>Processes conversational text for AI triage, donor search, and eligibility Q&amp;A.</w:t>
+              <w:t>ALL Groups (Universal Recipient)</w:t>
+            </w:r>
+          </w:p>
+        </w:tc>
+        <w:tc>
+          <w:tcPr>
+            <w:tcW w:type="dxa" w:w="2484"/>
+            <w:tcMar>
+              <w:top w:w="70" w:type="dxa"/>
+              <w:bottom w:w="70" w:type="dxa"/>
+              <w:left w:w="90" w:type="dxa"/>
+              <w:right w:w="90" w:type="dxa"/>
+            </w:tcMar>
+            <w:shd w:fill="F8FAFC"/>
+          </w:tcPr>
+          <w:p>
+            <w:r>
+              <w:t>AB+ Only</w:t>
             </w:r>
           </w:p>
         </w:tc>
@@ -1153,54 +1515,1007 @@
     </w:tbl>
     <w:p>
       <w:pPr>
-        <w:spacing w:after="200"/>
+        <w:keepNext/>
+        <w:spacing w:before="200" w:after="40"/>
       </w:pPr>
+      <w:r>
+        <w:rPr>
+          <w:rFonts w:ascii="Arial" w:hAnsi="Arial"/>
+          <w:b/>
+          <w:color w:val="1E293B"/>
+          <w:sz w:val="23"/>
+        </w:rPr>
+        <w:t>3.2 Match Ranking &amp; Geo-Proximity Weighting</w:t>
+      </w:r>
     </w:p>
     <w:p>
       <w:pPr>
-        <w:pStyle w:val="Heading1"/>
+        <w:spacing w:after="80" w:line="276" w:lineRule="auto"/>
       </w:pPr>
       <w:r>
         <w:rPr>
-          <w:color w:val="E11D48"/>
+          <w:rFonts w:ascii="Calibri" w:hAnsi="Calibri"/>
+          <w:color w:val="334155"/>
+          <w:sz w:val="20"/>
         </w:rPr>
-        <w:t>7. Verification, Testing &amp; Quality Assurance</w:t>
+        <w:t>When an emergency request is logged, Lifedrop executes a weighted ranking query: Rank = (Exact Match × 1.0 + Compatible Match × 0.7) × (City Proximity Weight) × (Live Availability Multiplier). This ensures exact ABO/Rh matches within the patient's immediate vicinity (e.g., McGann Hospital, Shivamogga) receive top notification priority.</w:t>
       </w:r>
     </w:p>
     <w:p>
       <w:r>
-        <w:t>The platform underwent rigorous testing across all modules using Python's standard `unittest` suite:</w:t>
-        <w:br/>
-        <w:t>• 16 Automated Backend Unit Tests passed with 100% success rate (`test_backend.py`).</w:t>
-        <w:br/>
-        <w:t>• Entity extraction and locality parser tested for Shivamogga, McGann Hospital, Nanjappa, and surrounding taluks.</w:t>
-        <w:br/>
-        <w:t>• Verified zero-hallucination compliance by testing unverified queries and medical safety boundaries.</w:t>
-        <w:br/>
-        <w:t>• Map route coordinates and Leaflet polyline rendering validated for road distances and ETA calculations.</w:t>
-        <w:br/>
-        <w:t>• Verified responsive UI integrity across all 7 frontend HTML pages.</w:t>
+        <w:br w:type="page"/>
       </w:r>
     </w:p>
     <w:p>
       <w:pPr>
-        <w:pStyle w:val="Heading1"/>
+        <w:keepNext/>
+        <w:spacing w:before="280" w:after="80"/>
       </w:pPr>
       <w:r>
         <w:rPr>
+          <w:rFonts w:ascii="Arial" w:hAnsi="Arial"/>
+          <w:b/>
           <w:color w:val="E11D48"/>
+          <w:sz w:val="28"/>
         </w:rPr>
-        <w:t>8. Conclusion &amp; Future Roadmap</w:t>
+        <w:t>4. Technical Implementation &amp; Database Schema</w:t>
+      </w:r>
+    </w:p>
+    <w:p>
+      <w:pPr>
+        <w:spacing w:after="80" w:line="276" w:lineRule="auto"/>
+      </w:pPr>
+      <w:r>
+        <w:rPr>
+          <w:rFonts w:ascii="Calibri" w:hAnsi="Calibri"/>
+          <w:color w:val="334155"/>
+          <w:sz w:val="20"/>
+        </w:rPr>
+        <w:t>Lifedrop is engineered with high resilience and zero unnecessary overhead. It utilizes Python Flask for backend services and SQLite for persistent relational data, alongside a hybrid local storage synchronization engine that permits full offline operation.</w:t>
+      </w:r>
+    </w:p>
+    <w:p>
+      <w:pPr>
+        <w:keepNext/>
+        <w:spacing w:before="200" w:after="40"/>
+      </w:pPr>
+      <w:r>
+        <w:rPr>
+          <w:rFonts w:ascii="Arial" w:hAnsi="Arial"/>
+          <w:b/>
+          <w:color w:val="1E293B"/>
+          <w:sz w:val="23"/>
+        </w:rPr>
+        <w:t>4.1 Relational Database Architecture (SQLite3)</w:t>
+      </w:r>
+    </w:p>
+    <w:p>
+      <w:pPr>
+        <w:spacing w:after="80" w:line="276" w:lineRule="auto"/>
+      </w:pPr>
+      <w:r>
+        <w:rPr>
+          <w:rFonts w:ascii="Calibri" w:hAnsi="Calibri"/>
+          <w:color w:val="334155"/>
+          <w:sz w:val="20"/>
+        </w:rPr>
+        <w:t>The database schema encompasses three primary entities designed for high query performance and integrity:</w:t>
+      </w:r>
+    </w:p>
+    <w:tbl>
+      <w:tblPr>
+        <w:tblW w:type="auto" w:w="0"/>
+        <w:jc w:val="center"/>
+        <w:tblLook w:firstColumn="1" w:firstRow="1" w:lastColumn="0" w:lastRow="0" w:noHBand="0" w:noVBand="1" w:val="04A0"/>
+      </w:tblPr>
+      <w:tblGrid>
+        <w:gridCol w:w="3312"/>
+        <w:gridCol w:w="3312"/>
+        <w:gridCol w:w="3312"/>
+      </w:tblGrid>
+      <w:tr>
+        <w:tc>
+          <w:tcPr>
+            <w:tcW w:type="dxa" w:w="3312"/>
+            <w:tcMar>
+              <w:top w:w="70" w:type="dxa"/>
+              <w:bottom w:w="70" w:type="dxa"/>
+              <w:left w:w="90" w:type="dxa"/>
+              <w:right w:w="90" w:type="dxa"/>
+            </w:tcMar>
+            <w:shd w:fill="0F172A"/>
+          </w:tcPr>
+          <w:p>
+            <w:r>
+              <w:rPr>
+                <w:rFonts w:ascii="Arial" w:hAnsi="Arial"/>
+                <w:b/>
+                <w:color w:val="FFFFFF"/>
+                <w:sz w:val="18"/>
+              </w:rPr>
+              <w:t>Table Name</w:t>
+            </w:r>
+          </w:p>
+        </w:tc>
+        <w:tc>
+          <w:tcPr>
+            <w:tcW w:type="dxa" w:w="3312"/>
+            <w:tcMar>
+              <w:top w:w="70" w:type="dxa"/>
+              <w:bottom w:w="70" w:type="dxa"/>
+              <w:left w:w="90" w:type="dxa"/>
+              <w:right w:w="90" w:type="dxa"/>
+            </w:tcMar>
+            <w:shd w:fill="0F172A"/>
+          </w:tcPr>
+          <w:p>
+            <w:r>
+              <w:rPr>
+                <w:rFonts w:ascii="Arial" w:hAnsi="Arial"/>
+                <w:b/>
+                <w:color w:val="FFFFFF"/>
+                <w:sz w:val="18"/>
+              </w:rPr>
+              <w:t>Key Columns &amp; Data Types</w:t>
+            </w:r>
+          </w:p>
+        </w:tc>
+        <w:tc>
+          <w:tcPr>
+            <w:tcW w:type="dxa" w:w="3312"/>
+            <w:tcMar>
+              <w:top w:w="70" w:type="dxa"/>
+              <w:bottom w:w="70" w:type="dxa"/>
+              <w:left w:w="90" w:type="dxa"/>
+              <w:right w:w="90" w:type="dxa"/>
+            </w:tcMar>
+            <w:shd w:fill="0F172A"/>
+          </w:tcPr>
+          <w:p>
+            <w:r>
+              <w:rPr>
+                <w:rFonts w:ascii="Arial" w:hAnsi="Arial"/>
+                <w:b/>
+                <w:color w:val="FFFFFF"/>
+                <w:sz w:val="18"/>
+              </w:rPr>
+              <w:t>Business Purpose</w:t>
+            </w:r>
+          </w:p>
+        </w:tc>
+      </w:tr>
+      <w:tr>
+        <w:tc>
+          <w:tcPr>
+            <w:tcW w:type="dxa" w:w="3312"/>
+            <w:tcMar>
+              <w:top w:w="70" w:type="dxa"/>
+              <w:bottom w:w="70" w:type="dxa"/>
+              <w:left w:w="90" w:type="dxa"/>
+              <w:right w:w="90" w:type="dxa"/>
+            </w:tcMar>
+            <w:shd w:fill="FFF1F2"/>
+          </w:tcPr>
+          <w:p>
+            <w:r>
+              <w:rPr>
+                <w:b/>
+                <w:color w:val="E11D48"/>
+              </w:rPr>
+              <w:t>donors</w:t>
+            </w:r>
+          </w:p>
+        </w:tc>
+        <w:tc>
+          <w:tcPr>
+            <w:tcW w:type="dxa" w:w="3312"/>
+            <w:tcMar>
+              <w:top w:w="70" w:type="dxa"/>
+              <w:bottom w:w="70" w:type="dxa"/>
+              <w:left w:w="90" w:type="dxa"/>
+              <w:right w:w="90" w:type="dxa"/>
+            </w:tcMar>
+            <w:shd w:fill="F8FAFC"/>
+          </w:tcPr>
+          <w:p>
+            <w:r>
+              <w:t>id (TEXT PK), name, blood_group, city, phone, available (INT), verified (INT), donations_count, last_donation</w:t>
+            </w:r>
+          </w:p>
+        </w:tc>
+        <w:tc>
+          <w:tcPr>
+            <w:tcW w:type="dxa" w:w="3312"/>
+            <w:tcMar>
+              <w:top w:w="70" w:type="dxa"/>
+              <w:bottom w:w="70" w:type="dxa"/>
+              <w:left w:w="90" w:type="dxa"/>
+              <w:right w:w="90" w:type="dxa"/>
+            </w:tcMar>
+            <w:shd w:fill="F8FAFC"/>
+          </w:tcPr>
+          <w:p>
+            <w:r>
+              <w:t>Stores registered volunteer donor profiles, live statuses, and donation history metrics.</w:t>
+            </w:r>
+          </w:p>
+        </w:tc>
+      </w:tr>
+      <w:tr>
+        <w:tc>
+          <w:tcPr>
+            <w:tcW w:type="dxa" w:w="3312"/>
+            <w:tcMar>
+              <w:top w:w="70" w:type="dxa"/>
+              <w:bottom w:w="70" w:type="dxa"/>
+              <w:left w:w="90" w:type="dxa"/>
+              <w:right w:w="90" w:type="dxa"/>
+            </w:tcMar>
+            <w:shd w:fill="FFF1F2"/>
+          </w:tcPr>
+          <w:p>
+            <w:r>
+              <w:rPr>
+                <w:b/>
+                <w:color w:val="E11D48"/>
+              </w:rPr>
+              <w:t>requests</w:t>
+            </w:r>
+          </w:p>
+        </w:tc>
+        <w:tc>
+          <w:tcPr>
+            <w:tcW w:type="dxa" w:w="3312"/>
+            <w:tcMar>
+              <w:top w:w="70" w:type="dxa"/>
+              <w:bottom w:w="70" w:type="dxa"/>
+              <w:left w:w="90" w:type="dxa"/>
+              <w:right w:w="90" w:type="dxa"/>
+            </w:tcMar>
+            <w:shd w:fill="F8FAFC"/>
+          </w:tcPr>
+          <w:p>
+            <w:r>
+              <w:t>id (TEXT PK), patient_name, blood_group, units_needed, hospital, city, urgency, contact_phone, status, timeline_json</w:t>
+            </w:r>
+          </w:p>
+        </w:tc>
+        <w:tc>
+          <w:tcPr>
+            <w:tcW w:type="dxa" w:w="3312"/>
+            <w:tcMar>
+              <w:top w:w="70" w:type="dxa"/>
+              <w:bottom w:w="70" w:type="dxa"/>
+              <w:left w:w="90" w:type="dxa"/>
+              <w:right w:w="90" w:type="dxa"/>
+            </w:tcMar>
+            <w:shd w:fill="F8FAFC"/>
+          </w:tcPr>
+          <w:p>
+            <w:r>
+              <w:t>Tracks emergency blood broadcasts, hospital locations, and real-time dispatch milestones.</w:t>
+            </w:r>
+          </w:p>
+        </w:tc>
+      </w:tr>
+      <w:tr>
+        <w:tc>
+          <w:tcPr>
+            <w:tcW w:type="dxa" w:w="3312"/>
+            <w:tcMar>
+              <w:top w:w="70" w:type="dxa"/>
+              <w:bottom w:w="70" w:type="dxa"/>
+              <w:left w:w="90" w:type="dxa"/>
+              <w:right w:w="90" w:type="dxa"/>
+            </w:tcMar>
+            <w:shd w:fill="FFF1F2"/>
+          </w:tcPr>
+          <w:p>
+            <w:r>
+              <w:rPr>
+                <w:b/>
+                <w:color w:val="E11D48"/>
+              </w:rPr>
+              <w:t>inventory</w:t>
+            </w:r>
+          </w:p>
+        </w:tc>
+        <w:tc>
+          <w:tcPr>
+            <w:tcW w:type="dxa" w:w="3312"/>
+            <w:tcMar>
+              <w:top w:w="70" w:type="dxa"/>
+              <w:bottom w:w="70" w:type="dxa"/>
+              <w:left w:w="90" w:type="dxa"/>
+              <w:right w:w="90" w:type="dxa"/>
+            </w:tcMar>
+            <w:shd w:fill="F8FAFC"/>
+          </w:tcPr>
+          <w:p>
+            <w:r>
+              <w:t>blood_group (TEXT PK), units_available, hospital_name, last_updated</w:t>
+            </w:r>
+          </w:p>
+        </w:tc>
+        <w:tc>
+          <w:tcPr>
+            <w:tcW w:type="dxa" w:w="3312"/>
+            <w:tcMar>
+              <w:top w:w="70" w:type="dxa"/>
+              <w:bottom w:w="70" w:type="dxa"/>
+              <w:left w:w="90" w:type="dxa"/>
+              <w:right w:w="90" w:type="dxa"/>
+            </w:tcMar>
+            <w:shd w:fill="F8FAFC"/>
+          </w:tcPr>
+          <w:p>
+            <w:r>
+              <w:t>Maintains live blood component stock levels across participating blood banks.</w:t>
+            </w:r>
+          </w:p>
+        </w:tc>
+      </w:tr>
+    </w:tbl>
+    <w:p>
+      <w:pPr>
+        <w:keepNext/>
+        <w:spacing w:before="200" w:after="40"/>
+      </w:pPr>
+      <w:r>
+        <w:rPr>
+          <w:rFonts w:ascii="Arial" w:hAnsi="Arial"/>
+          <w:b/>
+          <w:color w:val="1E293B"/>
+          <w:sz w:val="23"/>
+        </w:rPr>
+        <w:t>4.2 REST API Specification</w:t>
+      </w:r>
+    </w:p>
+    <w:p>
+      <w:pPr>
+        <w:spacing w:after="80" w:line="276" w:lineRule="auto"/>
+      </w:pPr>
+      <w:r>
+        <w:rPr>
+          <w:rFonts w:ascii="Calibri" w:hAnsi="Calibri"/>
+          <w:color w:val="334155"/>
+          <w:sz w:val="20"/>
+        </w:rPr>
+        <w:t>The backend exposes clean, RESTful JSON endpoints:</w:t>
+      </w:r>
+    </w:p>
+    <w:p>
+      <w:pPr>
+        <w:spacing w:after="80" w:line="276" w:lineRule="auto"/>
+      </w:pPr>
+      <w:r>
+        <w:rPr>
+          <w:rFonts w:ascii="Calibri" w:hAnsi="Calibri"/>
+          <w:color w:val="334155"/>
+          <w:sz w:val="20"/>
+        </w:rPr>
+        <w:t>• GET /api/health — System uptime and database connection verification.</w:t>
+      </w:r>
+    </w:p>
+    <w:p>
+      <w:pPr>
+        <w:spacing w:after="80" w:line="276" w:lineRule="auto"/>
+      </w:pPr>
+      <w:r>
+        <w:rPr>
+          <w:rFonts w:ascii="Calibri" w:hAnsi="Calibri"/>
+          <w:color w:val="334155"/>
+          <w:sz w:val="20"/>
+        </w:rPr>
+        <w:t>• GET /api/donors?bloodGroup=...&amp;city=... — Filtered query for available donors.</w:t>
+      </w:r>
+    </w:p>
+    <w:p>
+      <w:pPr>
+        <w:spacing w:after="80" w:line="276" w:lineRule="auto"/>
+      </w:pPr>
+      <w:r>
+        <w:rPr>
+          <w:rFonts w:ascii="Calibri" w:hAnsi="Calibri"/>
+          <w:color w:val="334155"/>
+          <w:sz w:val="20"/>
+        </w:rPr>
+        <w:t>• POST /api/donors — Register verified volunteer with automatic phone validation.</w:t>
+      </w:r>
+    </w:p>
+    <w:p>
+      <w:pPr>
+        <w:spacing w:after="80" w:line="276" w:lineRule="auto"/>
+      </w:pPr>
+      <w:r>
+        <w:rPr>
+          <w:rFonts w:ascii="Calibri" w:hAnsi="Calibri"/>
+          <w:color w:val="334155"/>
+          <w:sz w:val="20"/>
+        </w:rPr>
+        <w:t>• GET /api/donors/match?bloodGroup=...&amp;city=... — Execute real-time compatibility search.</w:t>
+      </w:r>
+    </w:p>
+    <w:p>
+      <w:pPr>
+        <w:spacing w:after="80" w:line="276" w:lineRule="auto"/>
+      </w:pPr>
+      <w:r>
+        <w:rPr>
+          <w:rFonts w:ascii="Calibri" w:hAnsi="Calibri"/>
+          <w:color w:val="334155"/>
+          <w:sz w:val="20"/>
+        </w:rPr>
+        <w:t>• POST /api/requests — Submit emergency blood broadcast and trigger automated alerts.</w:t>
+      </w:r>
+    </w:p>
+    <w:p>
+      <w:pPr>
+        <w:spacing w:after="80" w:line="276" w:lineRule="auto"/>
+      </w:pPr>
+      <w:r>
+        <w:rPr>
+          <w:rFonts w:ascii="Calibri" w:hAnsi="Calibri"/>
+          <w:color w:val="334155"/>
+          <w:sz w:val="20"/>
+        </w:rPr>
+        <w:t>• GET /api/requests/&lt;id&gt; — Live tracking endpoint with structured timeline progress.</w:t>
       </w:r>
     </w:p>
     <w:p>
       <w:r>
-        <w:t>Lifedrop Shivamogga establishes a robust, highly localized digital infrastructure for life-saving blood mobilization. Future milestones include automated WhatsApp/SMS notifications, IoT cold-chain temperature telemetry for transit bags, drone transport corridor integration for remote taluks, and expansion into neighboring districts of Malnad and coastal Karnataka.</w:t>
+        <w:br w:type="page"/>
+      </w:r>
+    </w:p>
+    <w:p>
+      <w:pPr>
+        <w:keepNext/>
+        <w:spacing w:before="280" w:after="80"/>
+      </w:pPr>
+      <w:r>
+        <w:rPr>
+          <w:rFonts w:ascii="Arial" w:hAnsi="Arial"/>
+          <w:b/>
+          <w:color w:val="E11D48"/>
+          <w:sz w:val="28"/>
+        </w:rPr>
+        <w:t>5. Live Dispatch Tracking &amp; Geospatial Architecture</w:t>
+      </w:r>
+    </w:p>
+    <w:p>
+      <w:pPr>
+        <w:spacing w:after="80" w:line="276" w:lineRule="auto"/>
+      </w:pPr>
+      <w:r>
+        <w:rPr>
+          <w:rFonts w:ascii="Calibri" w:hAnsi="Calibri"/>
+          <w:color w:val="334155"/>
+          <w:sz w:val="20"/>
+        </w:rPr>
+        <w:t>Transparency during emergencies relieves severe psychological distress for patients and families. The Lifedrop Live Tracker provides a synchronized timeline and interactive map showing exactly where the case stands.</w:t>
+      </w:r>
+    </w:p>
+    <w:p>
+      <w:pPr>
+        <w:keepNext/>
+        <w:spacing w:before="200" w:after="40"/>
+      </w:pPr>
+      <w:r>
+        <w:rPr>
+          <w:rFonts w:ascii="Arial" w:hAnsi="Arial"/>
+          <w:b/>
+          <w:color w:val="1E293B"/>
+          <w:sz w:val="23"/>
+        </w:rPr>
+        <w:t>5.1 Real-Time 4-Stage Dispatch Pipeline</w:t>
+      </w:r>
+    </w:p>
+    <w:p>
+      <w:pPr>
+        <w:spacing w:after="80" w:line="276" w:lineRule="auto"/>
+      </w:pPr>
+      <w:r>
+        <w:rPr>
+          <w:rFonts w:ascii="Calibri" w:hAnsi="Calibri"/>
+          <w:color w:val="334155"/>
+          <w:sz w:val="20"/>
+        </w:rPr>
+        <w:t>Every emergency blood request moves through four discrete operational stages:</w:t>
+      </w:r>
+    </w:p>
+    <w:p>
+      <w:pPr>
+        <w:spacing w:after="80" w:line="276" w:lineRule="auto"/>
+      </w:pPr>
+      <w:r>
+        <w:rPr>
+          <w:rFonts w:ascii="Calibri" w:hAnsi="Calibri"/>
+          <w:b/>
+          <w:color w:val="0F172A"/>
+          <w:sz w:val="20"/>
+        </w:rPr>
+        <w:t xml:space="preserve">Stage 1: Broadcast Active — </w:t>
+      </w:r>
+      <w:r>
+        <w:rPr>
+          <w:rFonts w:ascii="Calibri" w:hAnsi="Calibri"/>
+          <w:color w:val="334155"/>
+          <w:sz w:val="20"/>
+        </w:rPr>
+        <w:t>Request is submitted by hospital/attendant and broadcast to matching donors.</w:t>
+      </w:r>
+    </w:p>
+    <w:p>
+      <w:pPr>
+        <w:spacing w:after="80" w:line="276" w:lineRule="auto"/>
+      </w:pPr>
+      <w:r>
+        <w:rPr>
+          <w:rFonts w:ascii="Calibri" w:hAnsi="Calibri"/>
+          <w:b/>
+          <w:color w:val="0F172A"/>
+          <w:sz w:val="20"/>
+        </w:rPr>
+        <w:t xml:space="preserve">Stage 2: Donor Confirmed — </w:t>
+      </w:r>
+      <w:r>
+        <w:rPr>
+          <w:rFonts w:ascii="Calibri" w:hAnsi="Calibri"/>
+          <w:color w:val="334155"/>
+          <w:sz w:val="20"/>
+        </w:rPr>
+        <w:t>Compatible donor receives notification and accepts request; attendant notified.</w:t>
+      </w:r>
+    </w:p>
+    <w:p>
+      <w:pPr>
+        <w:spacing w:after="80" w:line="276" w:lineRule="auto"/>
+      </w:pPr>
+      <w:r>
+        <w:rPr>
+          <w:rFonts w:ascii="Calibri" w:hAnsi="Calibri"/>
+          <w:b/>
+          <w:color w:val="0F172A"/>
+          <w:sz w:val="20"/>
+        </w:rPr>
+        <w:t xml:space="preserve">Stage 3: En Route to Hospital — </w:t>
+      </w:r>
+      <w:r>
+        <w:rPr>
+          <w:rFonts w:ascii="Calibri" w:hAnsi="Calibri"/>
+          <w:color w:val="334155"/>
+          <w:sz w:val="20"/>
+        </w:rPr>
+        <w:t>Donor is traveling to blood bank/hospital; GPS coordinates updated.</w:t>
+      </w:r>
+    </w:p>
+    <w:p>
+      <w:pPr>
+        <w:spacing w:after="80" w:line="276" w:lineRule="auto"/>
+      </w:pPr>
+      <w:r>
+        <w:rPr>
+          <w:rFonts w:ascii="Calibri" w:hAnsi="Calibri"/>
+          <w:b/>
+          <w:color w:val="0F172A"/>
+          <w:sz w:val="20"/>
+        </w:rPr>
+        <w:t xml:space="preserve">Stage 4: Units Transfused — </w:t>
+      </w:r>
+      <w:r>
+        <w:rPr>
+          <w:rFonts w:ascii="Calibri" w:hAnsi="Calibri"/>
+          <w:color w:val="334155"/>
+          <w:sz w:val="20"/>
+        </w:rPr>
+        <w:t>Blood units verified, cross-matched, and administered to patient.</w:t>
+      </w:r>
+    </w:p>
+    <w:p>
+      <w:pPr>
+        <w:keepNext/>
+        <w:spacing w:before="200" w:after="40"/>
+      </w:pPr>
+      <w:r>
+        <w:rPr>
+          <w:rFonts w:ascii="Arial" w:hAnsi="Arial"/>
+          <w:b/>
+          <w:color w:val="1E293B"/>
+          <w:sz w:val="23"/>
+        </w:rPr>
+        <w:t>5.2 Geospatial Map Architecture (Leaflet.js &amp; OpenStreetMap)</w:t>
+      </w:r>
+    </w:p>
+    <w:p>
+      <w:pPr>
+        <w:spacing w:after="80" w:line="276" w:lineRule="auto"/>
+      </w:pPr>
+      <w:r>
+        <w:rPr>
+          <w:rFonts w:ascii="Calibri" w:hAnsi="Calibri"/>
+          <w:color w:val="334155"/>
+          <w:sz w:val="20"/>
+        </w:rPr>
+        <w:t>Lifedrop integrates OpenStreetMap tile servers via Leaflet.js to render regional healthcare facilities without external paid API dependencies. Key coordinates mapped in Shivamogga include:</w:t>
+      </w:r>
+    </w:p>
+    <w:p>
+      <w:pPr>
+        <w:spacing w:after="80" w:line="276" w:lineRule="auto"/>
+      </w:pPr>
+      <w:r>
+        <w:rPr>
+          <w:rFonts w:ascii="Calibri" w:hAnsi="Calibri"/>
+          <w:color w:val="334155"/>
+          <w:sz w:val="20"/>
+        </w:rPr>
+        <w:t>• McGann District Teaching Hospital (SIMS), Sagar Road (13.9324° N, 75.5684° E)</w:t>
+      </w:r>
+    </w:p>
+    <w:p>
+      <w:pPr>
+        <w:spacing w:after="80" w:line="276" w:lineRule="auto"/>
+      </w:pPr>
+      <w:r>
+        <w:rPr>
+          <w:rFonts w:ascii="Calibri" w:hAnsi="Calibri"/>
+          <w:color w:val="334155"/>
+          <w:sz w:val="20"/>
+        </w:rPr>
+        <w:t>• Sahyadri Super Specialty Hospital, Harakere (13.9056° N, 75.5892° E)</w:t>
+      </w:r>
+    </w:p>
+    <w:p>
+      <w:pPr>
+        <w:spacing w:after="80" w:line="276" w:lineRule="auto"/>
+      </w:pPr>
+      <w:r>
+        <w:rPr>
+          <w:rFonts w:ascii="Calibri" w:hAnsi="Calibri"/>
+          <w:color w:val="334155"/>
+          <w:sz w:val="20"/>
+        </w:rPr>
+        <w:t>• Rotary Blood Bank &amp; Diagnostic Centre, Durgigudi (13.9280° N, 75.5720° E)</w:t>
+      </w:r>
+    </w:p>
+    <w:p>
+      <w:pPr>
+        <w:spacing w:after="80" w:line="276" w:lineRule="auto"/>
+      </w:pPr>
+      <w:r>
+        <w:rPr>
+          <w:rFonts w:ascii="Calibri" w:hAnsi="Calibri"/>
+          <w:color w:val="334155"/>
+          <w:sz w:val="20"/>
+        </w:rPr>
+        <w:t>• Nanjappa Multi-Speciality Hospital, Kuvempu Road (13.9312° N, 75.5650° E)</w:t>
+      </w:r>
+    </w:p>
+    <w:p>
+      <w:pPr>
+        <w:spacing w:after="80" w:line="276" w:lineRule="auto"/>
+      </w:pPr>
+      <w:r>
+        <w:rPr>
+          <w:rFonts w:ascii="Calibri" w:hAnsi="Calibri"/>
+          <w:color w:val="334155"/>
+          <w:sz w:val="20"/>
+        </w:rPr>
+        <w:t>• Taluk General Hospitals in Bhadravathi, Sagara, and Thirthahalli.</w:t>
+      </w:r>
+    </w:p>
+    <w:p>
+      <w:r>
+        <w:br w:type="page"/>
+      </w:r>
+    </w:p>
+    <w:p>
+      <w:pPr>
+        <w:keepNext/>
+        <w:spacing w:before="280" w:after="80"/>
+      </w:pPr>
+      <w:r>
+        <w:rPr>
+          <w:rFonts w:ascii="Arial" w:hAnsi="Arial"/>
+          <w:b/>
+          <w:color w:val="E11D48"/>
+          <w:sz w:val="28"/>
+        </w:rPr>
+        <w:t>6. Deployment, Security &amp; Future Roadmap</w:t>
+      </w:r>
+    </w:p>
+    <w:p>
+      <w:pPr>
+        <w:spacing w:after="80" w:line="276" w:lineRule="auto"/>
+      </w:pPr>
+      <w:r>
+        <w:rPr>
+          <w:rFonts w:ascii="Calibri" w:hAnsi="Calibri"/>
+          <w:color w:val="334155"/>
+          <w:sz w:val="20"/>
+        </w:rPr>
+        <w:t>Lifedrop is engineered for effortless deployment across both modern cloud environments (Render, Vercel, Netlify, AWS) and local emergency server setups with zero cloud latency.</w:t>
+      </w:r>
+    </w:p>
+    <w:p>
+      <w:pPr>
+        <w:keepNext/>
+        <w:spacing w:before="200" w:after="40"/>
+      </w:pPr>
+      <w:r>
+        <w:rPr>
+          <w:rFonts w:ascii="Arial" w:hAnsi="Arial"/>
+          <w:b/>
+          <w:color w:val="1E293B"/>
+          <w:sz w:val="23"/>
+        </w:rPr>
+        <w:t>6.1 Security, Privacy &amp; Medical Ethics</w:t>
+      </w:r>
+    </w:p>
+    <w:p>
+      <w:pPr>
+        <w:spacing w:after="80" w:line="276" w:lineRule="auto"/>
+      </w:pPr>
+      <w:r>
+        <w:rPr>
+          <w:rFonts w:ascii="Calibri" w:hAnsi="Calibri"/>
+          <w:color w:val="334155"/>
+          <w:sz w:val="20"/>
+        </w:rPr>
+        <w:t>• Masked Contact Information: Attendant phone numbers are protected from public crawling.</w:t>
+      </w:r>
+    </w:p>
+    <w:p>
+      <w:pPr>
+        <w:spacing w:after="80" w:line="276" w:lineRule="auto"/>
+      </w:pPr>
+      <w:r>
+        <w:rPr>
+          <w:rFonts w:ascii="Calibri" w:hAnsi="Calibri"/>
+          <w:color w:val="334155"/>
+          <w:sz w:val="20"/>
+        </w:rPr>
+        <w:t>• Rate Limiting: Prevents automated denial-of-service or fake broadcast flooding.</w:t>
+      </w:r>
+    </w:p>
+    <w:p>
+      <w:pPr>
+        <w:spacing w:after="80" w:line="276" w:lineRule="auto"/>
+      </w:pPr>
+      <w:r>
+        <w:rPr>
+          <w:rFonts w:ascii="Calibri" w:hAnsi="Calibri"/>
+          <w:color w:val="334155"/>
+          <w:sz w:val="20"/>
+        </w:rPr>
+        <w:t>• Voluntary Consent: Donors retain complete control over their live availability toggles.</w:t>
+      </w:r>
+    </w:p>
+    <w:p>
+      <w:pPr>
+        <w:keepNext/>
+        <w:spacing w:before="200" w:after="40"/>
+      </w:pPr>
+      <w:r>
+        <w:rPr>
+          <w:rFonts w:ascii="Arial" w:hAnsi="Arial"/>
+          <w:b/>
+          <w:color w:val="1E293B"/>
+          <w:sz w:val="23"/>
+        </w:rPr>
+        <w:t>6.2 Regional Impact &amp; Scalability Milestones</w:t>
+      </w:r>
+    </w:p>
+    <w:tbl>
+      <w:tblPr>
+        <w:tblW w:type="auto" w:w="0"/>
+        <w:jc w:val="center"/>
+        <w:tblLook w:firstColumn="1" w:firstRow="1" w:lastColumn="0" w:lastRow="0" w:noHBand="0" w:noVBand="1" w:val="04A0"/>
+      </w:tblPr>
+      <w:tblGrid>
+        <w:gridCol w:w="4968"/>
+        <w:gridCol w:w="4968"/>
+      </w:tblGrid>
+      <w:tr>
+        <w:tc>
+          <w:tcPr>
+            <w:tcW w:type="dxa" w:w="4968"/>
+            <w:tcMar>
+              <w:top w:w="70" w:type="dxa"/>
+              <w:bottom w:w="70" w:type="dxa"/>
+              <w:left w:w="90" w:type="dxa"/>
+              <w:right w:w="90" w:type="dxa"/>
+            </w:tcMar>
+            <w:shd w:fill="0F172A"/>
+          </w:tcPr>
+          <w:p>
+            <w:r>
+              <w:rPr>
+                <w:rFonts w:ascii="Arial" w:hAnsi="Arial"/>
+                <w:b/>
+                <w:color w:val="FFFFFF"/>
+                <w:sz w:val="19"/>
+              </w:rPr>
+              <w:t>Implementation Milestone</w:t>
+            </w:r>
+          </w:p>
+        </w:tc>
+        <w:tc>
+          <w:tcPr>
+            <w:tcW w:type="dxa" w:w="4968"/>
+            <w:tcMar>
+              <w:top w:w="70" w:type="dxa"/>
+              <w:bottom w:w="70" w:type="dxa"/>
+              <w:left w:w="90" w:type="dxa"/>
+              <w:right w:w="90" w:type="dxa"/>
+            </w:tcMar>
+            <w:shd w:fill="0F172A"/>
+          </w:tcPr>
+          <w:p>
+            <w:r>
+              <w:rPr>
+                <w:rFonts w:ascii="Arial" w:hAnsi="Arial"/>
+                <w:b/>
+                <w:color w:val="FFFFFF"/>
+                <w:sz w:val="19"/>
+              </w:rPr>
+              <w:t>Projected Outcome &amp; Community Impact</w:t>
+            </w:r>
+          </w:p>
+        </w:tc>
+      </w:tr>
+      <w:tr>
+        <w:tc>
+          <w:tcPr>
+            <w:tcW w:type="dxa" w:w="4968"/>
+            <w:tcMar>
+              <w:top w:w="70" w:type="dxa"/>
+              <w:bottom w:w="70" w:type="dxa"/>
+              <w:left w:w="90" w:type="dxa"/>
+              <w:right w:w="90" w:type="dxa"/>
+            </w:tcMar>
+            <w:shd w:fill="FFF1F2"/>
+          </w:tcPr>
+          <w:p>
+            <w:r>
+              <w:rPr>
+                <w:b/>
+                <w:color w:val="E11D48"/>
+              </w:rPr>
+              <w:t>Phase 1: WhatsApp Cloud Bot</w:t>
+            </w:r>
+          </w:p>
+        </w:tc>
+        <w:tc>
+          <w:tcPr>
+            <w:tcW w:type="dxa" w:w="4968"/>
+            <w:tcMar>
+              <w:top w:w="70" w:type="dxa"/>
+              <w:bottom w:w="70" w:type="dxa"/>
+              <w:left w:w="90" w:type="dxa"/>
+              <w:right w:w="90" w:type="dxa"/>
+            </w:tcMar>
+            <w:shd w:fill="F8FAFC"/>
+          </w:tcPr>
+          <w:p>
+            <w:r>
+              <w:t>Integration with official WhatsApp Business API for instant 1-tap donor acceptances in Kannada and English.</w:t>
+            </w:r>
+          </w:p>
+        </w:tc>
+      </w:tr>
+      <w:tr>
+        <w:tc>
+          <w:tcPr>
+            <w:tcW w:type="dxa" w:w="4968"/>
+            <w:tcMar>
+              <w:top w:w="70" w:type="dxa"/>
+              <w:bottom w:w="70" w:type="dxa"/>
+              <w:left w:w="90" w:type="dxa"/>
+              <w:right w:w="90" w:type="dxa"/>
+            </w:tcMar>
+            <w:shd w:fill="FFF1F2"/>
+          </w:tcPr>
+          <w:p>
+            <w:r>
+              <w:rPr>
+                <w:b/>
+                <w:color w:val="E11D48"/>
+              </w:rPr>
+              <w:t>Phase 2: District Hospital EMR Sync</w:t>
+            </w:r>
+          </w:p>
+        </w:tc>
+        <w:tc>
+          <w:tcPr>
+            <w:tcW w:type="dxa" w:w="4968"/>
+            <w:tcMar>
+              <w:top w:w="70" w:type="dxa"/>
+              <w:bottom w:w="70" w:type="dxa"/>
+              <w:left w:w="90" w:type="dxa"/>
+              <w:right w:w="90" w:type="dxa"/>
+            </w:tcMar>
+            <w:shd w:fill="F8FAFC"/>
+          </w:tcPr>
+          <w:p>
+            <w:r>
+              <w:t>Direct integration with SIMS McGann Hospital HMIS for automated blood deficit alerts directly from trauma ICU.</w:t>
+            </w:r>
+          </w:p>
+        </w:tc>
+      </w:tr>
+      <w:tr>
+        <w:tc>
+          <w:tcPr>
+            <w:tcW w:type="dxa" w:w="4968"/>
+            <w:tcMar>
+              <w:top w:w="70" w:type="dxa"/>
+              <w:bottom w:w="70" w:type="dxa"/>
+              <w:left w:w="90" w:type="dxa"/>
+              <w:right w:w="90" w:type="dxa"/>
+            </w:tcMar>
+            <w:shd w:fill="FFF1F2"/>
+          </w:tcPr>
+          <w:p>
+            <w:r>
+              <w:rPr>
+                <w:b/>
+                <w:color w:val="E11D48"/>
+              </w:rPr>
+              <w:t>Phase 3: Malnad Taluk Drone Logistics</w:t>
+            </w:r>
+          </w:p>
+        </w:tc>
+        <w:tc>
+          <w:tcPr>
+            <w:tcW w:type="dxa" w:w="4968"/>
+            <w:tcMar>
+              <w:top w:w="70" w:type="dxa"/>
+              <w:bottom w:w="70" w:type="dxa"/>
+              <w:left w:w="90" w:type="dxa"/>
+              <w:right w:w="90" w:type="dxa"/>
+            </w:tcMar>
+            <w:shd w:fill="F8FAFC"/>
+          </w:tcPr>
+          <w:p>
+            <w:r>
+              <w:t>Support for IoT temperature-controlled medical drone delivery corridors connecting remote rural health centres to Shivamogga.</w:t>
+            </w:r>
+          </w:p>
+        </w:tc>
+      </w:tr>
+    </w:tbl>
+    <w:p>
+      <w:pPr>
+        <w:keepNext/>
+        <w:spacing w:before="200" w:after="40"/>
+      </w:pPr>
+      <w:r>
+        <w:rPr>
+          <w:rFonts w:ascii="Arial" w:hAnsi="Arial"/>
+          <w:b/>
+          <w:color w:val="1E293B"/>
+          <w:sz w:val="23"/>
+        </w:rPr>
+        <w:t>6.3 Conclusion</w:t>
+      </w:r>
+    </w:p>
+    <w:p>
+      <w:pPr>
+        <w:spacing w:after="80" w:line="276" w:lineRule="auto"/>
+      </w:pPr>
+      <w:r>
+        <w:rPr>
+          <w:rFonts w:ascii="Calibri" w:hAnsi="Calibri"/>
+          <w:color w:val="334155"/>
+          <w:sz w:val="20"/>
+        </w:rPr>
+        <w:t>Lifedrop represents a technological paradigm shift in emergency blood coordination for Shivamogga. By synthesizing real-time matching, clinical accuracy, live GPS tracking, and community gamification, Lifedrop transforms passive bystanders into active lifesavers, establishing a dependable safety net for the entire region.</w:t>
       </w:r>
     </w:p>
     <w:sectPr>
       <w:pgSz w:w="12240" w:h="15840"/>
-      <w:pgMar w:top="1440" w:right="1440" w:bottom="1440" w:left="1440" w:header="720" w:footer="720" w:gutter="0"/>
+      <w:pgMar w:top="1080" w:right="1152" w:bottom="1080" w:left="1152" w:header="720" w:footer="720" w:gutter="0"/>
       <w:cols w:space="720"/>
       <w:docGrid w:linePitch="360"/>
     </w:sectPr>

</xml_diff>